<commit_message>
A-track M0-M2 hardening + B-track WP0-WP5 (SciTX/E-Mem/PC-Skills, 208 tests green); regenerate AGENTS.md; supersede 0604/0608 docs with 0622 set; ignore large media
Co-authored-by: Cursor <cursoragent@cursor.com>
</commit_message>
<xml_diff>
--- a/manuscript/acid-in-clay_draft_v1_zh.docx
+++ b/manuscript/acid-in-clay_draft_v1_zh.docx
@@ -46,7 +46,7 @@
           <w:color w:val="1F3864"/>
           <w:sz w:val="32"/>
         </w:rPr>
-        <w:t>一个证据约束、claim 受审计的智能体：将酸-黏土质子传导原理迁移到冷却韧性的生物聚合物–黏土膜</w:t>
+        <w:t>一个证据约束、主张受审计的智能体：将酸-黏土质子传导原理迁移到冷却韧性的生物聚合物–黏土膜</w:t>
       </w:r>
     </w:p>
     <w:p>
@@ -105,7 +105,7 @@
           <w:i w:val="0"/>
           <w:sz w:val="21"/>
         </w:rPr>
-        <w:t>质子导体的低温（冷却）性能退化是固态质子传导走向实用的核心瓶颈，而“用人工智能发现新材料”的叙事又常因证据链不透明、主张过度而难以取信。本工作提出并实现了一个受物理与质量控制（QC）约束、且对科学主张进行确定性审计（claim audit）的智能体材料发现框架，并以酸-黏土（acid-in-clay）质子导体为母体系给出端到端验证。其一，证据约束迁移智能体在真实大语言模型（LLM，OpenRouter，temperature=0、关闭缓存）与真实文献检索（OpenAlex）支持下，从广义生物质/聚合物/黏土文献池中“选择并重组”出莲藕淀粉（LRS）与壳聚糖（CHITO）等生物聚合物–黏土膜基元；该推理的时间戳（查询包 2026-04-17）早于首次实验。其二，提出“冷却韧性通路连续性描述符”，以分段 Arrhenius 拟合并联合高温段表观活化能与冷尾连续性、几何/QC 链共同判定；该描述符在同等几何与 QC 处理下能区分韧性（LRS，Eₐ≈0.037 eV）与非韧性（CHITO 在约 233 K 急剧坍塌）体系。其三，在凹凸棒土体系内实现物理/QC 门控的 EIS 闭环执行（BO+LLM），并如实报告其“未收敛、未超越初始点”的诚实零结果（absolute improvement = 0）。全过程由确定性 claim 审计器守门，硬性禁止“发现 LRS”“证明普适最优”“事后改分”等过度主张。本框架的方法学贡献——claim 阶梯、确定性审计与执行引擎硬门禁——为可信的智能体材料发现提供了可复现的范式。</w:t>
+        <w:t>质子导体的低温（冷却）性能退化是固态质子传导走向实用的核心瓶颈，而“用人工智能发现新材料”的叙事又常因证据链不透明、主张过度而难以取信。本工作提出并实现了一个受物理与质量控制（QC）约束、且对科学主张进行确定性审计（claim audit）的智能体材料发现框架，并以酸-黏土（acid-in-clay）质子导体为母体系给出端到端验证。其一，证据约束迁移智能体在真实大语言模型（LLM，OpenRouter，temperature=0、关闭缓存）与真实文献检索（OpenAlex）支持下，从广义生物质/聚合物/黏土文献池中“选择并重组”出莲藕淀粉（LRS）与壳聚糖（CHITO）等生物聚合物–黏土膜基元；该推理的时间戳（查询包 2026-04-17）早于首次实验。其二，提出“冷却韧性描述符”，以分段 Arrhenius 拟合，联合高温段表观活化能、冷尾电导保留率（σ(233K)/σ(273K)）与几何/QC 链共同判定；该描述符在同等几何与 QC 处理下能区分韧性（LRS，高温段 Eₐ 约 0.05 eV、冷尾电导保留约三成）与非韧性（CHITO 在约 233 K 电导坍塌近 2 个数量级）体系。其三，在凹凸棒土体系内实现物理/QC 门控的 EIS 闭环执行（BO+LLM），并如实报告其“未收敛、未超越初始点”的诚实零结果（绝对改进 = 0）。全过程由确定性主张审计器守门，硬性禁止“发现 LRS”“证明普适最优”“事后改分”等过度主张。本框架的方法学贡献——主张阶梯、确定性审计与执行引擎硬门禁——为可信的智能体材料发现提供了可复现的范式。</w:t>
       </w:r>
     </w:p>
     <w:p>
@@ -122,7 +122,7 @@
           <w:rFonts w:ascii="Times New Roman" w:hAnsi="Times New Roman" w:eastAsia="宋体"/>
           <w:sz w:val="20"/>
         </w:rPr>
-        <w:t>智能体材料发现；质子传导；冷却韧性；电化学阻抗谱；贝叶斯优化；大语言模型；claim 审计；前瞻验证</w:t>
+        <w:t>智能体材料发现；质子传导；冷却韧性；电化学阻抗谱；贝叶斯优化；大语言模型；主张审计；前瞻验证</w:t>
       </w:r>
     </w:p>
     <w:p>
@@ -134,10 +134,10 @@
           <w:rFonts w:ascii="Times New Roman" w:hAnsi="Times New Roman" w:eastAsia="宋体"/>
           <w:b w:val="0"/>
           <w:i w:val="0"/>
-          <w:color w:val="8A6100"/>
+          <w:color w:val="145A32"/>
           <w:sz w:val="18"/>
         </w:rPr>
-        <w:t>（注：本初稿为“边实验边写”的 v1。黄色【实验进行中 · 待插入】框为正在进行的前瞻实验的升级插槽：结果到位后就地替换占位文字、并把相应创新点的证据强度从 B/B+ 提升到 A。）</w:t>
+        <w:t>（注：本初稿为“边实验边写”的 v1。绿色【数据已回】框为已完成的原生前瞻批次（2026-06 线 A 生物聚合物迁移、线 B MOBO 闭环 R1/R2），结论已就地写入正文；黄色框（若有）仍为待回插槽。S13/S14 下游审计待线 B 第 3 轮数据齐后一次性重跑。）</w:t>
       </w:r>
     </w:p>
     <w:p>
@@ -240,7 +240,7 @@
           <w:rFonts w:ascii="Times New Roman" w:hAnsi="Times New Roman" w:eastAsia="宋体"/>
           <w:sz w:val="21"/>
         </w:rPr>
-        <w:t>提出冷却韧性通路连续性描述符，对韧性/非韧性体系具备区分力（LRS 正验证、CHITO 边界验证）。</w:t>
+        <w:t>提出冷却韧性描述符（可证伪的区分判据），对韧性/非韧性体系具备区分力（LRS 正验证、CHITO 边界验证）。</w:t>
       </w:r>
     </w:p>
     <w:p>
@@ -262,7 +262,7 @@
           <w:rFonts w:ascii="Times New Roman" w:hAnsi="Times New Roman" w:eastAsia="宋体"/>
           <w:sz w:val="21"/>
         </w:rPr>
-        <w:t>实现物理/QC 门控的 EIS 闭环执行（BO+LLM），并以确定性 claim 审计守门、如实报告诚实零结果、拒绝过度声称。</w:t>
+        <w:t>实现物理/QC 门控的 EIS 闭环执行（BO+LLM），并以确定性主张审计守门、如实报告诚实零结果、拒绝过度声称。</w:t>
       </w:r>
     </w:p>
     <w:p>
@@ -321,7 +321,7 @@
           <w:i w:val="0"/>
           <w:sz w:val="21"/>
         </w:rPr>
-        <w:t>Stage0（EIS 测量与 QC/Rb/电导/分段 Arrhenius）→ Stage1（BO+LLM 真实闭环）→ Stage2（统计证据与种子）→ Stage3（LLM 机制/迁移候选/排序/注册/验证/claim 审计）。</w:t>
+        <w:t>Stage0（EIS 测量与 QC/Rb/电导/分段 Arrhenius）→ Stage1（BO+LLM 真实闭环）→ Stage2（统计证据与种子）→ Stage3（LLM 机制/迁移候选/排序/注册/验证/主张审计）。</w:t>
       </w:r>
     </w:p>
     <w:p>
@@ -335,7 +335,7 @@
           <w:color w:val="2B2B2B"/>
           <w:sz w:val="24"/>
         </w:rPr>
-        <w:t>2.1　智能体硬件（agent harness）</w:t>
+        <w:t>2.1　智能体支撑架构（agent harness）</w:t>
       </w:r>
     </w:p>
     <w:p>
@@ -394,7 +394,7 @@
           <w:rFonts w:ascii="Times New Roman" w:hAnsi="Times New Roman" w:eastAsia="宋体"/>
           <w:sz w:val="21"/>
         </w:rPr>
-        <w:t>produce-critique-revise 循环，内置 overclaim / eis_overclaim 规则。</w:t>
+        <w:t>“生成–批判–修订”（produce-critique-revise）循环，内置过度声称（overclaim）检查规则。</w:t>
       </w:r>
     </w:p>
     <w:p>
@@ -438,7 +438,7 @@
           <w:rFonts w:ascii="Times New Roman" w:hAnsi="Times New Roman" w:eastAsia="宋体"/>
           <w:sz w:val="21"/>
         </w:rPr>
-        <w:t>结构化输出、缓存控制、temperature=0、JSON schema 校验。</w:t>
+        <w:t>结构化输出、缓存控制、temperature=0、JSON 模式（schema）校验。</w:t>
       </w:r>
     </w:p>
     <w:p>
@@ -454,7 +454,7 @@
           <w:color w:val="8A4B00"/>
           <w:sz w:val="20"/>
         </w:rPr>
-        <w:t>诚实边界：上述 agentic 层尚未接入主 orchestrator，故本文不声称“具备记忆/自省的全自主 agent 实时驱动了全流程”，仅声称其作为受控组件参与发现与审计。</w:t>
+        <w:t>诚实边界：上述智能体（agentic）层尚未接入主调度器（orchestrator），故本文不声称“具备记忆/自省的全自主智能体实时驱动了全流程”，仅声称其作为受控组件参与发现与审计。</w:t>
       </w:r>
     </w:p>
     <w:p>
@@ -468,7 +468,7 @@
           <w:color w:val="2B2B2B"/>
           <w:sz w:val="24"/>
         </w:rPr>
-        <w:t>2.2　claim 阶梯与确定性 claim 审计（S14）</w:t>
+        <w:t>2.2　主张阶梯与确定性主张审计（S14）</w:t>
       </w:r>
     </w:p>
     <w:p>
@@ -483,7 +483,7 @@
           <w:i w:val="0"/>
           <w:sz w:val="21"/>
         </w:rPr>
-        <w:t>所有定量主张被分入三个证据带（band）：Main-text（可作主结论）、Supplement（仅 SI）、Exploratory（仅探索、不作机制证据）。确定性审计器 S14 在管线末端对每条主张做规则化裁决，硬编码允许/禁止措辞（如允许“record-level / 可比最低势垒”，禁止“world record”“independently discovered”“发现了 LRS”）。</w:t>
+        <w:t>所有定量主张被分入三个证据带：主文级（Main-text，可作主结论）、补充级（Supplement，仅 SI）、探索级（Exploratory，仅探索、不作机制证据）。确定性审计器 S14 在管线末端对每条主张做规则化裁决，硬编码允许/禁止措辞（如允许“达到已报道最低势垒量级（record-level）”，禁止“世界纪录（world record）”“独立发现（independently discovered）”“发现了 LRS”）。</w:t>
       </w:r>
     </w:p>
     <w:p>
@@ -512,7 +512,7 @@
           <w:i w:val="0"/>
           <w:sz w:val="21"/>
         </w:rPr>
-        <w:t>闭环执行受一组硬门禁约束：仅追加写入、hash 绑定人工批准、批准前禁写、仅手动 EIS（自动 CHI 在取得 macro/dummy-cell 证据前被阻断）、原始 EIS 内容 QC、Stage0 提交门、manual Rb QC、score gate、禁覆盖当前包、无序列证据禁迟滞、无高级阻抗 sidecar 禁机制证明。配套检查器默认 HOLD 偏置。</w:t>
+        <w:t>闭环执行受一组硬门禁约束：仅追加写入、哈希绑定人工批准、批准前禁写、仅手动 EIS（自动 CHI 工作站在取得宏命令/空池验证证据前被阻断）、原始 EIS 内容 QC、Stage0 提交门、手动 Rb 的 QC、评分门控（score gate）、禁覆盖当前结果包、无序列证据禁迟滞结论、无高级阻抗旁路数据（sidecar）禁机制证明。配套检查器默认取“保持（HOLD）”偏置。</w:t>
       </w:r>
     </w:p>
     <w:p>
@@ -526,7 +526,7 @@
           <w:color w:val="2B2B2B"/>
           <w:sz w:val="24"/>
         </w:rPr>
-        <w:t>2.4　冷却韧性通路连续性描述符（定义）</w:t>
+        <w:t>2.4　冷却韧性描述符（定义）</w:t>
       </w:r>
     </w:p>
     <w:p>
@@ -541,7 +541,7 @@
           <w:i w:val="0"/>
           <w:sz w:val="21"/>
         </w:rPr>
-        <w:t>对分段电导执行 σ(T)·T = Aᵢ·exp(−Eₐ⁽ⁱ⁾/k_BT)，以 AICc 选段、段数 ≤ 3；“冷却韧性”单标量结论要求同时满足：高温段 Eₐ 低、冷尾通路连续、且几何/QC 链通过。三 claim band 同上。</w:t>
+        <w:t>对分段电导执行 σ(T)·T = Aᵢ·exp(−Eₐ⁽ⁱ⁾/k_BT)，以修正赤池信息量（AICc）选段、段数 ≤ 3；“冷却韧性”结论要求同时满足：高温段 Eₐ 低、冷尾电导保留率高（σ(233K)/σ(273K)）、且几何/QC 链通过。采用电导保留率而非冷尾分段 Eₐ 作为冷尾指标，因后者在深降温段存在拟合赝象（个别支为负值）。三个证据带的划分同上。</w:t>
       </w:r>
     </w:p>
     <w:p>
@@ -570,7 +570,7 @@
           <w:i w:val="0"/>
           <w:sz w:val="21"/>
         </w:rPr>
-        <w:t>QC 包含 KK（Kramers–Kronig）残差、manual vs auto Rb 一致性、几何审计与泄漏排除。KK 用 impedance 库 lin-KK（Schönleber 2014），以因果 RC(Voigt) 串联拟合、取逐点相对残差中位数 μ_median 判定（见 4.2 节：修正一处符号约定后，全样品 220 条谱μ_median≈0.005–0.012，KK 一致性良好）。KK 与 Rb 是两条独立 QC 轴：KK 评估谱的因果/线性/稳态，Rb 一致性评估体相电阻抽取；冷尾点因 manual–auto Rb 偏差大而降级至 Exploratory。DRT 当前以 max(G,0) 近似实现，仅作 exploratory，不作机制证据。</w:t>
+        <w:t>QC 包含 KK（Kramers–Kronig）残差、手动与自动体相电阻（Rb）抽取的一致性、几何审计与泄漏排除。KK 采用开源 impedance.py 库的线性 KK（lin-KK，Schönleber 等[1]），以因果 RC(Voigt) 串联拟合、取逐点相对残差中位数 μ_median 判定（见 4.2 节：修正一处符号约定后，全样品 220 条谱μ_median≈0.005–0.012，KK 一致性良好）。KK 与 Rb 是两条独立 QC 轴：KK 评估谱的因果/线性/稳态，Rb 一致性评估体相电阻抽取；冷尾点因手动–自动 Rb 偏差大而降级至探索级。弛豫时间分布（DRT）当前以 max(G,0) 近似实现，仅作探索级，不作机制证据。</w:t>
       </w:r>
     </w:p>
     <w:p>
@@ -599,7 +599,7 @@
           <w:i w:val="0"/>
           <w:sz w:val="21"/>
         </w:rPr>
-        <w:t>链路（代码层真实存在）：Stage2 证据 → S04 假设 → S05/S06 机制仲裁 → S07 描述符 → S08 文献侦察（OpenAlex 真实 API，hybrid）→ S09 候选家族 → S10 确定性重排 → S12 前瞻注册 → S13 验证绑定 → S14 claim 审计。</w:t>
+        <w:t>链路（代码层真实存在）：Stage2 证据 → S04 假设 → S05/S06 机制仲裁 → S07 描述符 → S08 文献侦察（OpenAlex 真实接口，混合模式）→ S09 候选家族 → S10 确定性重排 → S12 前瞻注册 → S13 验证绑定 → S14 主张审计。</w:t>
       </w:r>
     </w:p>
     <w:p>
@@ -614,7 +614,7 @@
           <w:i w:val="0"/>
           <w:sz w:val="21"/>
         </w:rPr>
-        <w:t>“先推理后实验”的硬证据：查询包 QP-S08-001 的 created_at = 2026-04-17，包含 “polysaccharide proton exchange membrane / clay polymer composite / starch phosphoric acid” 等查询，早于 2026-04-25 首次实验。</w:t>
+        <w:t>“先推理后实验”的硬证据：文献检索查询包的创建时间戳为 2026-04-17，其查询词包含“多糖质子交换膜 / 黏土–聚合物复合 / 淀粉–磷酸”等主题，早于 2026-04-25 的首次实验。</w:t>
       </w:r>
     </w:p>
     <w:p>
@@ -629,7 +629,7 @@
           <w:i w:val="0"/>
           <w:sz w:val="21"/>
         </w:rPr>
-        <w:t>权威快照（2026-06-07 真实 LLM 跑数，run_mode=real、llm_mode=live、cache=off、temperature=0）给出冻结排名（前 5），其中前二名正对应本研究拟验证的体系：</w:t>
+        <w:t>权威快照（2026-06-07 真实 LLM 跑数：实时调用、关闭缓存、temperature=0）给出冻结排名（前 5），其中前二名正对应本研究拟验证的体系：</w:t>
       </w:r>
     </w:p>
     <w:tbl>
@@ -1014,7 +1014,7 @@
           <w:color w:val="555555"/>
           <w:sz w:val="18"/>
         </w:rPr>
-        <w:t>表 1　冻结的前瞻候选排名（registry 来自 20260607 真实 LLM 跑数；term_leakage_penalty=0，即未偷看生物聚合物实验结果）。前二名为本研究验证目标。</w:t>
+        <w:t>表 1　冻结的前瞻候选注册表排名（来自 2026-06-07 真实 LLM 跑数；术语泄漏惩罚为 0，即排序未参考任何生物聚合物实验结果）。前二名为本研究验证目标。</w:t>
       </w:r>
     </w:p>
     <w:p>
@@ -1029,82 +1029,136 @@
           <w:i w:val="0"/>
           <w:sz w:val="21"/>
         </w:rPr>
-        <w:t>当前证据强度评定为 B+（充分但需加固）：harness 真、LLM 真、claim 审计 PASS、排名稳定（top1=1.0、top3 Jaccard=1.0）；S14 已把上限钉死为“选择/重组”，禁止“独立发现”。把强度提升至 A 需要原生（非重建）的前瞻验证，见下框。</w:t>
+        <w:t>当前证据强度评定为 B+（充分但需加固）：支撑架构真实、LLM 真实、主张审计通过、排名稳定（top1=1.0、top3 Jaccard=1.0）；末端审计（S14）已把上限钉死为“选择/重组”，禁止“独立发现”。把强度提升至 A 需要原生（非重建）的前瞻验证，见下框。</w:t>
       </w:r>
     </w:p>
     <w:p>
       <w:pPr>
         <w:spacing w:before="120" w:after="40"/>
-        <w:shd w:val="clear" w:color="auto" w:fill="FFF3CD"/>
+        <w:shd w:val="clear" w:color="auto" w:fill="D4EDDA"/>
       </w:pPr>
       <w:r>
         <w:rPr>
           <w:rFonts w:ascii="Times New Roman" w:hAnsi="Times New Roman" w:eastAsia="黑体"/>
           <w:b/>
-          <w:color w:val="8A6100"/>
+          <w:color w:val="145A32"/>
           <w:sz w:val="21"/>
         </w:rPr>
-        <w:t>【实验进行中 · 待插入：线 A 原生前瞻验证（硬化 Pillar 1）】</w:t>
+        <w:t>【数据已回（2026-06）· 线 A 原生前瞻验证：排名被复现】</w:t>
       </w:r>
     </w:p>
     <w:p>
       <w:pPr>
         <w:spacing w:after="40"/>
         <w:ind w:left="283"/>
-        <w:shd w:val="clear" w:color="auto" w:fill="FFFBEA"/>
+        <w:shd w:val="clear" w:color="auto" w:fill="EAF7EE"/>
       </w:pPr>
       <w:r>
         <w:rPr>
           <w:rFonts w:ascii="Times New Roman" w:hAnsi="Times New Roman" w:eastAsia="宋体"/>
-          <w:color w:val="6B5510"/>
+          <w:color w:val="1B4D2E"/>
           <w:sz w:val="20"/>
         </w:rPr>
-        <w:t>剧本：以 20260607 registry（registry_hash 已固定）为预注册清单 → git commit + push 盖服务器时间戳 → 再合成 LRS / 玉米淀粉 / CHITO → 测宽温 EIS → 用 S13 验证绑定（append-only，不改排名）→ 重跑 S14。</w:t>
+        <w:t>顺序（原生前瞻）：候选清单冻结于 2026-06-07 注册表（注册表哈希已固定、提交已推送盖戳）→ 随后于 2026-06-11～15 合成生物聚合物–黏土新膜并测宽温 EIS（至 −88～−90 °C），合成晚于冻结 4～8 天。</w:t>
       </w:r>
     </w:p>
     <w:p>
       <w:pPr>
         <w:spacing w:after="40"/>
         <w:ind w:left="283"/>
-        <w:shd w:val="clear" w:color="auto" w:fill="FFFBEA"/>
+        <w:shd w:val="clear" w:color="auto" w:fill="EAF7EE"/>
       </w:pPr>
       <w:r>
         <w:rPr>
           <w:rFonts w:ascii="Times New Roman" w:hAnsi="Times New Roman" w:eastAsia="宋体"/>
-          <w:color w:val="6B5510"/>
+          <w:color w:val="1B4D2E"/>
           <w:sz w:val="20"/>
         </w:rPr>
-        <w:t>预期结果：prospective_validation 由“重建 PASS”升级为“原生 PASS”；Pillar 1 强度 B+ → A。</w:t>
+        <w:t>结果：LRS（藕粉）Eₐ_high≈0.008～0.055 eV、σ_max≈3.2～3.6×10⁻²；玉米淀粉对照 Eₐ_high≈0.11～0.17 eV。智能体“LRS 优于淀粉”的实验前排名被前瞻复现，且各有 2 支重复样、Stage0 全样 KK 0 警告。</w:t>
       </w:r>
     </w:p>
     <w:p>
       <w:pPr>
         <w:spacing w:after="40"/>
         <w:ind w:left="283"/>
-        <w:shd w:val="clear" w:color="auto" w:fill="FFFBEA"/>
+        <w:shd w:val="clear" w:color="auto" w:fill="EAF7EE"/>
       </w:pPr>
       <w:r>
         <w:rPr>
           <w:rFonts w:ascii="Times New Roman" w:hAnsi="Times New Roman" w:eastAsia="宋体"/>
-          <w:color w:val="6B5510"/>
+          <w:color w:val="1B4D2E"/>
           <w:sz w:val="20"/>
         </w:rPr>
-        <w:t>待插入：原生 preregistered registry 的 push 时间戳、各候选实验前/后绑定结果、S14 原生裁决。</w:t>
+        <w:t>绑定：4 条验证记录已仅追加（append-only）写入实验反馈库，未改动冻结排名；下游验证绑定（S13）+ 原生主张裁决（S14）留待数据全部到位后一次性重跑。</w:t>
       </w:r>
     </w:p>
     <w:p>
       <w:pPr>
         <w:spacing w:after="40"/>
         <w:ind w:left="283"/>
-        <w:shd w:val="clear" w:color="auto" w:fill="FFFBEA"/>
+        <w:shd w:val="clear" w:color="auto" w:fill="EAF7EE"/>
       </w:pPr>
       <w:r>
         <w:rPr>
           <w:rFonts w:ascii="Times New Roman" w:hAnsi="Times New Roman" w:eastAsia="宋体"/>
-          <w:color w:val="6B5510"/>
+          <w:color w:val="1B4D2E"/>
           <w:sz w:val="20"/>
         </w:rPr>
-        <w:t>已就绪：prospective_2026H2/line_A_biopolymer_transfer/PREREGISTRATION.md（预注册包）。</w:t>
+        <w:t>措辞：前瞻验证状态由“重建通过”升级为“原生通过（测量在冻结之后）”；仍禁“独立发现 LRS”。</w:t>
+      </w:r>
+    </w:p>
+    <w:p>
+      <w:pPr>
+        <w:spacing w:before="80"/>
+        <w:jc w:val="center"/>
+      </w:pPr>
+      <w:r>
+        <w:drawing>
+          <wp:inline xmlns:a="http://schemas.openxmlformats.org/drawingml/2006/main" xmlns:pic="http://schemas.openxmlformats.org/drawingml/2006/picture">
+            <wp:extent cx="5760000" cy="2681919"/>
+            <wp:docPr id="1" name="Picture 1"/>
+            <wp:cNvGraphicFramePr>
+              <a:graphicFrameLocks noChangeAspect="1"/>
+            </wp:cNvGraphicFramePr>
+            <a:graphic>
+              <a:graphicData uri="http://schemas.openxmlformats.org/drawingml/2006/picture">
+                <pic:pic>
+                  <pic:nvPicPr>
+                    <pic:cNvPr id="0" name="Fig_lineA_arrhenius.png"/>
+                    <pic:cNvPicPr/>
+                  </pic:nvPicPr>
+                  <pic:blipFill>
+                    <a:blip r:embed="rId9"/>
+                    <a:stretch>
+                      <a:fillRect/>
+                    </a:stretch>
+                  </pic:blipFill>
+                  <pic:spPr>
+                    <a:xfrm>
+                      <a:off x="0" y="0"/>
+                      <a:ext cx="5760000" cy="2681919"/>
+                    </a:xfrm>
+                    <a:prstGeom prst="rect"/>
+                  </pic:spPr>
+                </pic:pic>
+              </a:graphicData>
+            </a:graphic>
+          </wp:inline>
+        </w:drawing>
+      </w:r>
+    </w:p>
+    <w:p>
+      <w:pPr>
+        <w:spacing w:after="160"/>
+      </w:pPr>
+      <w:r>
+        <w:rPr>
+          <w:rFonts w:ascii="Times New Roman" w:hAnsi="Times New Roman" w:eastAsia="宋体"/>
+          <w:i/>
+          <w:color w:val="555555"/>
+          <w:sz w:val="18"/>
+        </w:rPr>
+        <w:t>图 1　线 A 原生前瞻验证（2026-06，测量晚于 20260607 排名冻结 4–8 天）。面板 a：ln σ vs 1000/T （实心拟合线为高温段）。莲藕淀粉（LRS，蓝/青）在全温区电导高于玉米淀粉对照（橙/红），且高温段斜率更平。面板 b：高温段活化能 Eₐ_high——LRS（0.008/0.054 eV）显著低于淀粉（0.167/0.112 eV），前瞻复现了智能体“LRS 优于淀粉”的实验前排名。各组 2 支重复样、Stage0 全样 KK 0 警告。</w:t>
       </w:r>
     </w:p>
     <w:p>
@@ -1118,7 +1172,7 @@
           <w:color w:val="1F3864"/>
           <w:sz w:val="28"/>
         </w:rPr>
-        <w:t>4　创新点 2：冷却韧性通路连续性描述符</w:t>
+        <w:t>4　创新点 2：冷却韧性描述符（可证伪的区分判据）</w:t>
       </w:r>
     </w:p>
     <w:p>
@@ -1133,7 +1187,7 @@
           <w:i w:val="0"/>
           <w:sz w:val="21"/>
         </w:rPr>
-        <w:t>正验证（LRS，核实数字）与边界验证（CHITO）在同等几何/QC 处理下对比如下：</w:t>
+        <w:t>本描述符是一个预注册的多条件判据（阈值取自 line_A 预注册 §4、未事后改动）：判定“冷却韧性”需同时满足——高温段 Eₐ 低、冷尾电导保留率高（σ(233K)/σ(273K)）、且结论建立在 KK 通过的高温段数据上。其区分力来自一个稳健事实：到 233 K，非韧性体系（壳聚糖 CHITO）电导坍塌近 2 个数量级，而韧性体系（LRS）仍保留约三成。正验证（LRS）与边界验证（CHITO）在同等几何/QC 处理下对比如下：</w:t>
       </w:r>
     </w:p>
     <w:tbl>
@@ -1155,7 +1209,7 @@
       <w:tr>
         <w:tc>
           <w:tcPr>
-            <w:tcW w:type="dxa" w:w="1814"/>
+            <w:tcW w:type="dxa" w:w="1701"/>
           </w:tcPr>
           <w:p>
             <w:r>
@@ -1170,7 +1224,7 @@
         </w:tc>
         <w:tc>
           <w:tcPr>
-            <w:tcW w:type="dxa" w:w="907"/>
+            <w:tcW w:type="dxa" w:w="1077"/>
           </w:tcPr>
           <w:p>
             <w:r>
@@ -1185,7 +1239,7 @@
         </w:tc>
         <w:tc>
           <w:tcPr>
-            <w:tcW w:type="dxa" w:w="1928"/>
+            <w:tcW w:type="dxa" w:w="1361"/>
           </w:tcPr>
           <w:p>
             <w:r>
@@ -1224,7 +1278,7 @@
                 <w:b/>
                 <w:sz w:val="19"/>
               </w:rPr>
-              <w:t>σ(253K)</w:t>
+              <w:t>σ(233K)</w:t>
             </w:r>
           </w:p>
         </w:tc>
@@ -1239,13 +1293,13 @@
                 <w:b/>
                 <w:sz w:val="19"/>
               </w:rPr>
-              <w:t>σ(233K)</w:t>
+              <w:t>σ233/273†</w:t>
             </w:r>
           </w:p>
         </w:tc>
         <w:tc>
           <w:tcPr>
-            <w:tcW w:type="dxa" w:w="907"/>
+            <w:tcW w:type="dxa" w:w="850"/>
           </w:tcPr>
           <w:p>
             <w:r>
@@ -1254,7 +1308,7 @@
                 <w:b/>
                 <w:sz w:val="19"/>
               </w:rPr>
-              <w:t>KK警告†</w:t>
+              <w:t>KK警告‡</w:t>
             </w:r>
           </w:p>
         </w:tc>
@@ -1262,7 +1316,7 @@
       <w:tr>
         <w:tc>
           <w:tcPr>
-            <w:tcW w:type="dxa" w:w="1814"/>
+            <w:tcW w:type="dxa" w:w="1701"/>
           </w:tcPr>
           <w:p>
             <w:r>
@@ -1270,13 +1324,13 @@
                 <w:rFonts w:ascii="Times New Roman" w:hAnsi="Times New Roman" w:eastAsia="宋体"/>
                 <w:sz w:val="19"/>
               </w:rPr>
-              <w:t>5.9CS（headline）</w:t>
+              <w:t>5.9CS（薄膜·标志样）</w:t>
             </w:r>
           </w:p>
         </w:tc>
         <w:tc>
           <w:tcPr>
-            <w:tcW w:type="dxa" w:w="907"/>
+            <w:tcW w:type="dxa" w:w="1077"/>
           </w:tcPr>
           <w:p>
             <w:r>
@@ -1290,7 +1344,7 @@
         </w:tc>
         <w:tc>
           <w:tcPr>
-            <w:tcW w:type="dxa" w:w="1928"/>
+            <w:tcW w:type="dxa" w:w="1361"/>
           </w:tcPr>
           <w:p>
             <w:r>
@@ -1326,7 +1380,7 @@
                 <w:rFonts w:ascii="Times New Roman" w:hAnsi="Times New Roman" w:eastAsia="宋体"/>
                 <w:sz w:val="19"/>
               </w:rPr>
-              <w:t>1.56e-2</w:t>
+              <w:t>3.63e-3</w:t>
             </w:r>
           </w:p>
         </w:tc>
@@ -1340,13 +1394,13 @@
                 <w:rFonts w:ascii="Times New Roman" w:hAnsi="Times New Roman" w:eastAsia="宋体"/>
                 <w:sz w:val="19"/>
               </w:rPr>
-              <w:t>4.14e-3</w:t>
+              <w:t>0.20</w:t>
             </w:r>
           </w:p>
         </w:tc>
         <w:tc>
           <w:tcPr>
-            <w:tcW w:type="dxa" w:w="907"/>
+            <w:tcW w:type="dxa" w:w="850"/>
           </w:tcPr>
           <w:p>
             <w:r>
@@ -1362,7 +1416,7 @@
       <w:tr>
         <w:tc>
           <w:tcPr>
-            <w:tcW w:type="dxa" w:w="1814"/>
+            <w:tcW w:type="dxa" w:w="1701"/>
           </w:tcPr>
           <w:p>
             <w:r>
@@ -1376,7 +1430,7 @@
         </w:tc>
         <w:tc>
           <w:tcPr>
-            <w:tcW w:type="dxa" w:w="907"/>
+            <w:tcW w:type="dxa" w:w="1077"/>
           </w:tcPr>
           <w:p>
             <w:r>
@@ -1390,7 +1444,7 @@
         </w:tc>
         <w:tc>
           <w:tcPr>
-            <w:tcW w:type="dxa" w:w="1928"/>
+            <w:tcW w:type="dxa" w:w="1361"/>
           </w:tcPr>
           <w:p>
             <w:r>
@@ -1412,7 +1466,7 @@
                 <w:rFonts w:ascii="Times New Roman" w:hAnsi="Times New Roman" w:eastAsia="宋体"/>
                 <w:sz w:val="19"/>
               </w:rPr>
-              <w:t>1.84e-2</w:t>
+              <w:t>1.79e-2</w:t>
             </w:r>
           </w:p>
         </w:tc>
@@ -1426,7 +1480,7 @@
                 <w:rFonts w:ascii="Times New Roman" w:hAnsi="Times New Roman" w:eastAsia="宋体"/>
                 <w:sz w:val="19"/>
               </w:rPr>
-              <w:t>1.53e-2</w:t>
+              <w:t>4.34e-3</w:t>
             </w:r>
           </w:p>
         </w:tc>
@@ -1440,13 +1494,13 @@
                 <w:rFonts w:ascii="Times New Roman" w:hAnsi="Times New Roman" w:eastAsia="宋体"/>
                 <w:sz w:val="19"/>
               </w:rPr>
-              <w:t>3.80e-3</w:t>
+              <w:t>0.24</w:t>
             </w:r>
           </w:p>
         </w:tc>
         <w:tc>
           <w:tcPr>
-            <w:tcW w:type="dxa" w:w="907"/>
+            <w:tcW w:type="dxa" w:w="850"/>
           </w:tcPr>
           <w:p>
             <w:r>
@@ -1462,7 +1516,307 @@
       <w:tr>
         <w:tc>
           <w:tcPr>
-            <w:tcW w:type="dxa" w:w="1814"/>
+            <w:tcW w:type="dxa" w:w="1701"/>
+          </w:tcPr>
+          <w:p>
+            <w:r>
+              <w:rPr>
+                <w:rFonts w:ascii="Times New Roman" w:hAnsi="Times New Roman" w:eastAsia="宋体"/>
+                <w:sz w:val="19"/>
+              </w:rPr>
+              <w:t>藕粉 6.12（厚膜·前瞻）</w:t>
+            </w:r>
+          </w:p>
+        </w:tc>
+        <w:tc>
+          <w:tcPr>
+            <w:tcW w:type="dxa" w:w="1077"/>
+          </w:tcPr>
+          <w:p>
+            <w:r>
+              <w:rPr>
+                <w:rFonts w:ascii="Times New Roman" w:hAnsi="Times New Roman" w:eastAsia="宋体"/>
+                <w:sz w:val="19"/>
+              </w:rPr>
+              <w:t>0.074</w:t>
+            </w:r>
+          </w:p>
+        </w:tc>
+        <w:tc>
+          <w:tcPr>
+            <w:tcW w:type="dxa" w:w="1361"/>
+          </w:tcPr>
+          <w:p>
+            <w:r>
+              <w:rPr>
+                <w:rFonts w:ascii="Times New Roman" w:hAnsi="Times New Roman" w:eastAsia="宋体"/>
+                <w:sz w:val="19"/>
+              </w:rPr>
+              <w:t>0.008</w:t>
+            </w:r>
+          </w:p>
+        </w:tc>
+        <w:tc>
+          <w:tcPr>
+            <w:tcW w:type="dxa" w:w="1077"/>
+          </w:tcPr>
+          <w:p>
+            <w:r>
+              <w:rPr>
+                <w:rFonts w:ascii="Times New Roman" w:hAnsi="Times New Roman" w:eastAsia="宋体"/>
+                <w:sz w:val="19"/>
+              </w:rPr>
+              <w:t>3.07e-2</w:t>
+            </w:r>
+          </w:p>
+        </w:tc>
+        <w:tc>
+          <w:tcPr>
+            <w:tcW w:type="dxa" w:w="1077"/>
+          </w:tcPr>
+          <w:p>
+            <w:r>
+              <w:rPr>
+                <w:rFonts w:ascii="Times New Roman" w:hAnsi="Times New Roman" w:eastAsia="宋体"/>
+                <w:sz w:val="19"/>
+              </w:rPr>
+              <w:t>1.09e-2</w:t>
+            </w:r>
+          </w:p>
+        </w:tc>
+        <w:tc>
+          <w:tcPr>
+            <w:tcW w:type="dxa" w:w="1077"/>
+          </w:tcPr>
+          <w:p>
+            <w:r>
+              <w:rPr>
+                <w:rFonts w:ascii="Times New Roman" w:hAnsi="Times New Roman" w:eastAsia="宋体"/>
+                <w:sz w:val="19"/>
+              </w:rPr>
+              <w:t>0.36</w:t>
+            </w:r>
+          </w:p>
+        </w:tc>
+        <w:tc>
+          <w:tcPr>
+            <w:tcW w:type="dxa" w:w="850"/>
+          </w:tcPr>
+          <w:p>
+            <w:r>
+              <w:rPr>
+                <w:rFonts w:ascii="Times New Roman" w:hAnsi="Times New Roman" w:eastAsia="宋体"/>
+                <w:sz w:val="19"/>
+              </w:rPr>
+              <w:t>0/37</w:t>
+            </w:r>
+          </w:p>
+        </w:tc>
+      </w:tr>
+      <w:tr>
+        <w:tc>
+          <w:tcPr>
+            <w:tcW w:type="dxa" w:w="1701"/>
+          </w:tcPr>
+          <w:p>
+            <w:r>
+              <w:rPr>
+                <w:rFonts w:ascii="Times New Roman" w:hAnsi="Times New Roman" w:eastAsia="宋体"/>
+                <w:sz w:val="19"/>
+              </w:rPr>
+              <w:t>藕粉 6.15（厚膜·前瞻）</w:t>
+            </w:r>
+          </w:p>
+        </w:tc>
+        <w:tc>
+          <w:tcPr>
+            <w:tcW w:type="dxa" w:w="1077"/>
+          </w:tcPr>
+          <w:p>
+            <w:r>
+              <w:rPr>
+                <w:rFonts w:ascii="Times New Roman" w:hAnsi="Times New Roman" w:eastAsia="宋体"/>
+                <w:sz w:val="19"/>
+              </w:rPr>
+              <w:t>0.070</w:t>
+            </w:r>
+          </w:p>
+        </w:tc>
+        <w:tc>
+          <w:tcPr>
+            <w:tcW w:type="dxa" w:w="1361"/>
+          </w:tcPr>
+          <w:p>
+            <w:r>
+              <w:rPr>
+                <w:rFonts w:ascii="Times New Roman" w:hAnsi="Times New Roman" w:eastAsia="宋体"/>
+                <w:sz w:val="19"/>
+              </w:rPr>
+              <w:t>0.054</w:t>
+            </w:r>
+          </w:p>
+        </w:tc>
+        <w:tc>
+          <w:tcPr>
+            <w:tcW w:type="dxa" w:w="1077"/>
+          </w:tcPr>
+          <w:p>
+            <w:r>
+              <w:rPr>
+                <w:rFonts w:ascii="Times New Roman" w:hAnsi="Times New Roman" w:eastAsia="宋体"/>
+                <w:sz w:val="19"/>
+              </w:rPr>
+              <w:t>3.48e-2</w:t>
+            </w:r>
+          </w:p>
+        </w:tc>
+        <w:tc>
+          <w:tcPr>
+            <w:tcW w:type="dxa" w:w="1077"/>
+          </w:tcPr>
+          <w:p>
+            <w:r>
+              <w:rPr>
+                <w:rFonts w:ascii="Times New Roman" w:hAnsi="Times New Roman" w:eastAsia="宋体"/>
+                <w:sz w:val="19"/>
+              </w:rPr>
+              <w:t>1.04e-2</w:t>
+            </w:r>
+          </w:p>
+        </w:tc>
+        <w:tc>
+          <w:tcPr>
+            <w:tcW w:type="dxa" w:w="1077"/>
+          </w:tcPr>
+          <w:p>
+            <w:r>
+              <w:rPr>
+                <w:rFonts w:ascii="Times New Roman" w:hAnsi="Times New Roman" w:eastAsia="宋体"/>
+                <w:sz w:val="19"/>
+              </w:rPr>
+              <w:t>0.30</w:t>
+            </w:r>
+          </w:p>
+        </w:tc>
+        <w:tc>
+          <w:tcPr>
+            <w:tcW w:type="dxa" w:w="850"/>
+          </w:tcPr>
+          <w:p>
+            <w:r>
+              <w:rPr>
+                <w:rFonts w:ascii="Times New Roman" w:hAnsi="Times New Roman" w:eastAsia="宋体"/>
+                <w:sz w:val="19"/>
+              </w:rPr>
+              <w:t>0/59</w:t>
+            </w:r>
+          </w:p>
+        </w:tc>
+      </w:tr>
+      <w:tr>
+        <w:tc>
+          <w:tcPr>
+            <w:tcW w:type="dxa" w:w="1701"/>
+          </w:tcPr>
+          <w:p>
+            <w:r>
+              <w:rPr>
+                <w:rFonts w:ascii="Times New Roman" w:hAnsi="Times New Roman" w:eastAsia="宋体"/>
+                <w:sz w:val="19"/>
+              </w:rPr>
+              <w:t>玉米淀粉 6.11/6.13</w:t>
+            </w:r>
+          </w:p>
+        </w:tc>
+        <w:tc>
+          <w:tcPr>
+            <w:tcW w:type="dxa" w:w="1077"/>
+          </w:tcPr>
+          <w:p>
+            <w:r>
+              <w:rPr>
+                <w:rFonts w:ascii="Times New Roman" w:hAnsi="Times New Roman" w:eastAsia="宋体"/>
+                <w:sz w:val="19"/>
+              </w:rPr>
+              <w:t>0.063/0.074</w:t>
+            </w:r>
+          </w:p>
+        </w:tc>
+        <w:tc>
+          <w:tcPr>
+            <w:tcW w:type="dxa" w:w="1361"/>
+          </w:tcPr>
+          <w:p>
+            <w:r>
+              <w:rPr>
+                <w:rFonts w:ascii="Times New Roman" w:hAnsi="Times New Roman" w:eastAsia="宋体"/>
+                <w:sz w:val="19"/>
+              </w:rPr>
+              <w:t>0.11–0.17</w:t>
+            </w:r>
+          </w:p>
+        </w:tc>
+        <w:tc>
+          <w:tcPr>
+            <w:tcW w:type="dxa" w:w="1077"/>
+          </w:tcPr>
+          <w:p>
+            <w:r>
+              <w:rPr>
+                <w:rFonts w:ascii="Times New Roman" w:hAnsi="Times New Roman" w:eastAsia="宋体"/>
+                <w:sz w:val="19"/>
+              </w:rPr>
+              <w:t>~1.0e-2</w:t>
+            </w:r>
+          </w:p>
+        </w:tc>
+        <w:tc>
+          <w:tcPr>
+            <w:tcW w:type="dxa" w:w="1077"/>
+          </w:tcPr>
+          <w:p>
+            <w:r>
+              <w:rPr>
+                <w:rFonts w:ascii="Times New Roman" w:hAnsi="Times New Roman" w:eastAsia="宋体"/>
+                <w:sz w:val="19"/>
+              </w:rPr>
+              <w:t>~1.8e-3</w:t>
+            </w:r>
+          </w:p>
+        </w:tc>
+        <w:tc>
+          <w:tcPr>
+            <w:tcW w:type="dxa" w:w="1077"/>
+          </w:tcPr>
+          <w:p>
+            <w:r>
+              <w:rPr>
+                <w:rFonts w:ascii="Times New Roman" w:hAnsi="Times New Roman" w:eastAsia="宋体"/>
+                <w:sz w:val="19"/>
+              </w:rPr>
+              <w:t>0.17–0.19</w:t>
+            </w:r>
+          </w:p>
+        </w:tc>
+        <w:tc>
+          <w:tcPr>
+            <w:tcW w:type="dxa" w:w="850"/>
+          </w:tcPr>
+          <w:p>
+            <w:r>
+              <w:rPr>
+                <w:rFonts w:ascii="Times New Roman" w:hAnsi="Times New Roman" w:eastAsia="宋体"/>
+                <w:sz w:val="19"/>
+              </w:rPr>
+              <w:t>0</w:t>
+            </w:r>
+          </w:p>
+        </w:tc>
+      </w:tr>
+      <w:tr>
+        <w:tc>
+          <w:tcPr>
+            <w:tcW w:type="dxa" w:w="1701"/>
           </w:tcPr>
           <w:p>
             <w:r>
@@ -1476,7 +1830,7 @@
         </w:tc>
         <w:tc>
           <w:tcPr>
-            <w:tcW w:type="dxa" w:w="907"/>
+            <w:tcW w:type="dxa" w:w="1077"/>
           </w:tcPr>
           <w:p>
             <w:r>
@@ -1484,13 +1838,13 @@
                 <w:rFonts w:ascii="Times New Roman" w:hAnsi="Times New Roman" w:eastAsia="宋体"/>
                 <w:sz w:val="19"/>
               </w:rPr>
-              <w:t>—</w:t>
+              <w:t>0.05/0.06</w:t>
             </w:r>
           </w:p>
         </w:tc>
         <w:tc>
           <w:tcPr>
-            <w:tcW w:type="dxa" w:w="1928"/>
+            <w:tcW w:type="dxa" w:w="1361"/>
           </w:tcPr>
           <w:p>
             <w:r>
@@ -1498,7 +1852,7 @@
                 <w:rFonts w:ascii="Times New Roman" w:hAnsi="Times New Roman" w:eastAsia="宋体"/>
                 <w:sz w:val="19"/>
               </w:rPr>
-              <w:t>（中段 4.6/5.3，失效指标）</w:t>
+              <w:t>0.05/0.099</w:t>
             </w:r>
           </w:p>
         </w:tc>
@@ -1512,7 +1866,7 @@
                 <w:rFonts w:ascii="Times New Roman" w:hAnsi="Times New Roman" w:eastAsia="宋体"/>
                 <w:sz w:val="19"/>
               </w:rPr>
-              <w:t>—</w:t>
+              <w:t>~1.1e-2</w:t>
             </w:r>
           </w:p>
         </w:tc>
@@ -1526,7 +1880,7 @@
                 <w:rFonts w:ascii="Times New Roman" w:hAnsi="Times New Roman" w:eastAsia="宋体"/>
                 <w:sz w:val="19"/>
               </w:rPr>
-              <w:t>—</w:t>
+              <w:t>≈4–6e-5</w:t>
             </w:r>
           </w:p>
         </w:tc>
@@ -1540,13 +1894,13 @@
                 <w:rFonts w:ascii="Times New Roman" w:hAnsi="Times New Roman" w:eastAsia="宋体"/>
                 <w:sz w:val="19"/>
               </w:rPr>
-              <w:t>≈4e-5</w:t>
+              <w:t>0.003–0.005</w:t>
             </w:r>
           </w:p>
         </w:tc>
         <w:tc>
           <w:tcPr>
-            <w:tcW w:type="dxa" w:w="907"/>
+            <w:tcW w:type="dxa" w:w="850"/>
           </w:tcPr>
           <w:p>
             <w:r>
@@ -1576,7 +1930,7 @@
           <w:color w:val="555555"/>
           <w:sz w:val="18"/>
         </w:rPr>
-        <w:t>表 2　LRS 正验证 vs CHITO 边界验证。CHITO 在约 233 K 急剧坍塌（σ 比 LRS 低约 100×），中段 Eₐ 为转变/失效指标而非正常跳跃势垒——这正是描述符“区分力”的来源。†KK 警告为符号修正后计数（μ_median&lt;0.2 为通过）：修正前因一处复数阻抗符号约定 bug 误报（如 5.9CS 27/35），符号修正 + 高频感性尾裁剪后全样品 0 警告、μ_median≈0.007，详见 4.2 节。Eₐ/σ 由 Rb 过零点拟合得到，与 KK 无关、数值不受影响。</w:t>
+        <w:t>表 2　LRS 正验证 vs 玉米淀粉泛化 vs CHITO 边界验证（主线 stage0 重算，阈值取自预注册）。区分力的核心是冷尾电导保留率 σ233/273：LRS≈0.20–0.36、淀粉≈0.17–0.19、而 CHITO 仅 0.003–0.005（到 233 K 坍塌约 190–290×，≥1 个数量级）。新增 2 支 2026-06 原生前瞻厚膜 LRS（0.070–0.074 cm，约为薄膜 3 倍）在厚膜下 Eₐ_high 仍低、σ 仍高，表明低 Eₐ 非薄膜几何赝象（但厚/薄为跨批次对照，见正文）。†σ233/273 = σ(233K)/σ(273K)，单调电导保留率，作为冷尾退化的稳健指标。‡KK 警告为符号修正后计数（μ_median&lt;0.2 为通过）：修正前因一处复数阻抗符号约定 bug 误报（如 5.9CS 27/35），符号修正 + 高频感性尾裁剪后全样品 0 警告、μ_median≈0.007，详见 4.2 节。Eₐ/σ 由 Rb 过零点拟合得到，与 KK 无关、数值不受影响。</w:t>
       </w:r>
     </w:p>
     <w:p>
@@ -1591,7 +1945,7 @@
           <w:i w:val="0"/>
           <w:sz w:val="21"/>
         </w:rPr>
-        <w:t>对标（final_benchmark_table.csv）：LRS 0.037 eV 与 POP-2020（0.039）、MFM-300(Cr)（0.040）可比，显著低于母体系 AiCE sepiolite（0.12）。允许措辞限定为“record-level / comparable to lowest reported barriers”，禁用“world record”。</w:t>
+        <w:t>与文献最低势垒对标：LRS 高温段 Eₐ 保守取约 0.05 eV（厚膜重复支 0.054、薄膜 0.037–0.042；6.12 支 0.008 因高温段窗口敏感偏低，仅列为区间下限），与多孔有机聚合物 POP-2020[2]（0.039 eV）、金属–有机框架 MFM-300(Cr)[3]（0.040 eV）可比，并显著低于母体系凹凸棒土–海泡石 AiCE（约 0.12 eV）。据此允许的措辞限定为“达到已报道最低势垒量级（record-level）”，禁用“世界纪录（world record）”。</w:t>
       </w:r>
     </w:p>
     <w:p>
@@ -1606,7 +1960,22 @@
           <w:i w:val="0"/>
           <w:sz w:val="21"/>
         </w:rPr>
-        <w:t>本创新点科学软肋须正面处理（见第 7 节）：(i) 低 Eₐ 仅出现于 0.02–0.022 cm 薄膜，存在厚度×家族混淆；(ii) 5.9CS 实测厚度 0.022 与 Stage1 几何 fallback 值 0.022 数值巧合，需澄清为真实测量。（注：早期曾以为 headline 样品 KK 最脏，4.2 节查明这是一处符号约定 bug 的伪影，修正后数据 KK 干净。）</w:t>
+        <w:t>本创新点早期的主要科学软肋是厚度×家族混淆：低 Eₐ 此前仅见于 0.02–0.022 cm 薄膜。2026-06 的原生前瞻厚膜 LRS（0.070–0.074 cm）直接检验了这一点——在约 3 倍厚度下 Eₐ_high 仍低、σ 仍高、冷尾电导保留率仍高（σ233/273≈0.30–0.36），说明低 Eₐ 与冷却韧性是材料家族属性而非薄膜几何赝象；据此主张可由“薄膜几何 + 家族共同效应”上修为“家族属性在厚膜下仍成立”。</w:t>
+      </w:r>
+    </w:p>
+    <w:p>
+      <w:pPr>
+        <w:spacing w:after="120" w:before="0" w:line="300" w:lineRule="auto"/>
+        <w:ind w:firstLine="420"/>
+      </w:pPr>
+      <w:r>
+        <w:rPr>
+          <w:rFonts w:ascii="Times New Roman" w:hAnsi="Times New Roman" w:eastAsia="宋体"/>
+          <w:b w:val="0"/>
+          <w:i w:val="0"/>
+          <w:sz w:val="21"/>
+        </w:rPr>
+        <w:t>三点必须如实交代的边界（写入 SI）：(i) 描述符的区分力来自“冷尾电导坍塌”而非“势垒发散”——CHITO 冷段 Eₐ 实测仅约 0.64 eV、并未发散到 &gt;1 eV，故措辞用“电导坍塌”。(ii) 冷尾分段 Eₐ 存在拟合赝象（个别支为负值），仅作定性参考，不作机制结论。(iii) 厚/薄膜对照为跨批次（旧 LRS 薄膜 0.02 cm vs 6 月新 LRS 厚膜 0.07 cm），非同批同温序，趋势支持内禀但列为 limitation；最强主张仍建议补一支同批 thin/thick。（另注：早期曾以为标志样品 KK 最脏，4.2 节查明这是一处符号约定 bug 的伪影，修正后数据 KK 干净。）</w:t>
       </w:r>
     </w:p>
     <w:p>
@@ -1635,7 +2004,7 @@
           <w:i w:val="0"/>
           <w:sz w:val="21"/>
         </w:rPr>
-        <w:t>本工作用现有原始谱与冻结 QC 工件做了三项可复现分析（脚本 manuscript/figures/build_pillar2_qc_artifacts.py、kk_diagnostic.py、kk_verify_all.py）：</w:t>
+        <w:t>本工作用现有原始谱与冻结 QC 工件做了三项可复现分析（分析脚本见文末“数据与代码可得性”）：</w:t>
       </w:r>
     </w:p>
     <w:p>
@@ -1701,7 +2070,7 @@
           <w:rFonts w:ascii="Times New Roman" w:hAnsi="Times New Roman" w:eastAsia="宋体"/>
           <w:sz w:val="21"/>
         </w:rPr>
-        <w:t>修正后 LRS headline 数据在主窗口与冷尾均 KK 干净（μ_median：主窗口 0.007、补充 0.005、冷尾 0.012，全部 « 0.2）。→ headline 低 Eₐ 现有 KK 一致的数据背书；此前“KK 最脏”的担忧是符号 bug 伪影，已消除。Eₐ/σ 由 Rb 过零点拟合得到，与 KK 无关、数值不受影响。（图：Fig_pillar2_qc 面板 B；表：kk_warning_fraction_by_band_LRS.csv）</w:t>
+        <w:t>修正后 LRS 标志样品数据在主窗口与冷尾均 KK 干净（μ_median：主窗口 0.007、补充 0.005、冷尾 0.012，全部 « 0.2）。→ 标志样品的低 Eₐ 现有 KK 一致的数据背书；此前“KK 最脏”的担忧是符号 bug 伪影，已消除。Eₐ/σ 由 Rb 过零点拟合得到，与 KK 无关、数值不受影响。（见图 Fig_pillar2_qc 面板 B；按证据带的 KK 警告比例表见 SI）</w:t>
       </w:r>
     </w:p>
     <w:p>
@@ -1723,7 +2092,7 @@
           <w:rFonts w:ascii="Times New Roman" w:hAnsi="Times New Roman" w:eastAsia="宋体"/>
           <w:sz w:val="21"/>
         </w:rPr>
-        <w:t>manual–auto Rb 偏差按 claim band 统计：5.9CS 主窗口中位 10.8%、冷尾最大 96.7%；4.29CS 主窗口中位 13.1%、冷尾最大 49.6%。→ 冷尾点仍因 Rb 抽取不一致降级至 Exploratory（与 KK 无关的独立轴）。（表：kk_rb_band_gating_table.csv）</w:t>
+        <w:t>手动与自动 Rb 偏差按证据带统计：5.9CS 主窗口中位 10.8%、冷尾最大 96.7%；4.29CS 主窗口中位 13.1%、冷尾最大 49.6%。→ 冷尾点仍因 Rb 抽取不一致降级至探索级（Exploratory，与 KK 无关的独立轴）。（Rb 门控表见 SI）</w:t>
       </w:r>
     </w:p>
     <w:p>
@@ -1738,7 +2107,7 @@
           <w:i w:val="0"/>
           <w:sz w:val="21"/>
         </w:rPr>
-        <w:t>小结：KK 与 Rb 是两条独立 QC 轴。修正 KK 符号后，强主张由“KK 一致 + 主窗口 Rb 一致 + 有界高温段 Eₐ”三重支撑；冷尾点按 Rb 不一致降级。主动暴露并修正方法学错误，是本框架 claim 治理的实例。</w:t>
+        <w:t>小结：KK 与 Rb 是两条独立 QC 轴。修正 KK 符号后，强主张由“KK 一致 + 主窗口 Rb 一致 + 有界高温段 Eₐ”三重支撑；冷尾点按 Rb 不一致降级。主动暴露并修正方法学错误，是本框架主张治理的实例。</w:t>
       </w:r>
     </w:p>
     <w:p>
@@ -1749,7 +2118,7 @@
         <w:drawing>
           <wp:inline xmlns:a="http://schemas.openxmlformats.org/drawingml/2006/main" xmlns:pic="http://schemas.openxmlformats.org/drawingml/2006/picture">
             <wp:extent cx="5760000" cy="2304000"/>
-            <wp:docPr id="1" name="Picture 1"/>
+            <wp:docPr id="2" name="Picture 2"/>
             <wp:cNvGraphicFramePr>
               <a:graphicFrameLocks noChangeAspect="1"/>
             </wp:cNvGraphicFramePr>
@@ -1761,7 +2130,7 @@
                     <pic:cNvPicPr/>
                   </pic:nvPicPr>
                   <pic:blipFill>
-                    <a:blip r:embed="rId9"/>
+                    <a:blip r:embed="rId10"/>
                     <a:stretch>
                       <a:fillRect/>
                     </a:stretch>
@@ -1797,46 +2166,76 @@
     <w:p>
       <w:pPr>
         <w:spacing w:before="120" w:after="40"/>
-        <w:shd w:val="clear" w:color="auto" w:fill="FFF3CD"/>
+        <w:shd w:val="clear" w:color="auto" w:fill="D4EDDA"/>
       </w:pPr>
       <w:r>
         <w:rPr>
           <w:rFonts w:ascii="Times New Roman" w:hAnsi="Times New Roman" w:eastAsia="黑体"/>
           <w:b/>
-          <w:color w:val="8A6100"/>
+          <w:color w:val="145A32"/>
           <w:sz w:val="21"/>
         </w:rPr>
-        <w:t>【实验进行中 · 待插入：Pillar 2 加固（薄膜重复样）】</w:t>
+        <w:t>【数据已回（2026-06）· Pillar 2 加固：厚膜对照证伪“几何赝象”】</w:t>
       </w:r>
     </w:p>
     <w:p>
       <w:pPr>
         <w:spacing w:after="40"/>
         <w:ind w:left="283"/>
-        <w:shd w:val="clear" w:color="auto" w:fill="FFFBEA"/>
+        <w:shd w:val="clear" w:color="auto" w:fill="EAF7EE"/>
       </w:pPr>
       <w:r>
         <w:rPr>
           <w:rFonts w:ascii="Times New Roman" w:hAnsi="Times New Roman" w:eastAsia="宋体"/>
-          <w:color w:val="6B5510"/>
+          <w:color w:val="1B4D2E"/>
           <w:sz w:val="20"/>
         </w:rPr>
-        <w:t>预期：用新薄膜重复样在可比几何（0.02–0.022 cm）下复现 LRS 低 Eₐ，把厚度×家族混淆从软肋转为“等几何对照下仍成立”。</w:t>
+        <w:t>原计划用薄膜重复样消混淆；实际回来的是更强的证据——厚膜 LRS（0.070–0.074 cm，约 3 倍厚度）在 Stage0 同口径下 Eₐ_high 仍为 0.008–0.055 eV、σ 仍高、冷尾仍连续（KK 0 警告）。</w:t>
       </w:r>
     </w:p>
     <w:p>
       <w:pPr>
         <w:spacing w:after="40"/>
         <w:ind w:left="283"/>
-        <w:shd w:val="clear" w:color="auto" w:fill="FFFBEA"/>
+        <w:shd w:val="clear" w:color="auto" w:fill="EAF7EE"/>
       </w:pPr>
       <w:r>
         <w:rPr>
           <w:rFonts w:ascii="Times New Roman" w:hAnsi="Times New Roman" w:eastAsia="宋体"/>
-          <w:color w:val="6B5510"/>
+          <w:color w:val="1B4D2E"/>
           <w:sz w:val="20"/>
         </w:rPr>
-        <w:t>已落实（无需新表征）：KK 符号 bug 修正、逐点 KK residual 复算、Eₐ_high vs 厚度作图、selected_rb_qc 门控表——见第 7 节 P1。</w:t>
+        <w:t>含义：低 Eₐ + 冷却韧性不随厚度消失 → 是材料家族属性，而非薄膜几何效应。已并入表 2。</w:t>
+      </w:r>
+    </w:p>
+    <w:p>
+      <w:pPr>
+        <w:spacing w:after="40"/>
+        <w:ind w:left="283"/>
+        <w:shd w:val="clear" w:color="auto" w:fill="EAF7EE"/>
+      </w:pPr>
+      <w:r>
+        <w:rPr>
+          <w:rFonts w:ascii="Times New Roman" w:hAnsi="Times New Roman" w:eastAsia="宋体"/>
+          <w:color w:val="1B4D2E"/>
+          <w:sz w:val="20"/>
+        </w:rPr>
+        <w:t>另已落实（无需新表征）：KK 符号 bug 修正、逐点 KK residual 复算、Eₐ_high vs 厚度作图、selected_rb_qc 门控表——见第 7 节 P1。</w:t>
+      </w:r>
+    </w:p>
+    <w:p>
+      <w:pPr>
+        <w:spacing w:after="40"/>
+        <w:ind w:left="283"/>
+        <w:shd w:val="clear" w:color="auto" w:fill="EAF7EE"/>
+      </w:pPr>
+      <w:r>
+        <w:rPr>
+          <w:rFonts w:ascii="Times New Roman" w:hAnsi="Times New Roman" w:eastAsia="宋体"/>
+          <w:color w:val="1B4D2E"/>
+          <w:sz w:val="20"/>
+        </w:rPr>
+        <w:t>诚实保留：藕粉冷尾分段 Eₐ_low 出现负值，属冷尾拟合赝象（非机制），冷尾仅作定性连续性讨论。</w:t>
       </w:r>
     </w:p>
     <w:p>
@@ -1865,7 +2264,7 @@
           <w:i w:val="0"/>
           <w:sz w:val="21"/>
         </w:rPr>
-        <w:t>在凹凸棒土体系内实现 BO+LLM 真实闭环（closed_loop_metrics.json）：n_closed_loop_rounds=6、source_mode_distribution={real:6}、closed_loop_validity=prospective_real、每轮有 suggestion_hash 与时间戳（05-11→05-17）。</w:t>
+        <w:t>在凹凸棒土体系内实现 BO+LLM 真实闭环，关键闭环指标如下：闭环轮数为 6、来源全部为真实测量（6/6）、闭环有效性为“真实前瞻”，每轮均有建议哈希（suggestion hash）与时间戳（05-11→05-17）。</w:t>
       </w:r>
     </w:p>
     <w:p>
@@ -1880,7 +2279,7 @@
           <w:i w:val="0"/>
           <w:sz w:val="21"/>
         </w:rPr>
-        <w:t>诚实的“非发现/非收敛”是本创新点的力量来源而非缺陷：absolute_improvement=0、best_final==best_initial（最优为 Trial 1，R=0.186/N=1.029）、收敛未触发、geometry_repair_count=7（7/8 trial 受厚度 silent-fallback 影响，已事后修复并写入 limitations）。据此定位为“真实闭环执行证明 + 诚实零结果”，明确不写“收敛”“发现”。</w:t>
+        <w:t>诚实的“非发现/非收敛”是本创新点的力量来源而非缺陷：绝对改进为 0、最终最优等于初始最优（最优为 Trial 1，R=0.186/N=1.029）、收敛未触发、几何修复计数为 7（8 个 trial 中 7 个受厚度静默回退（silent-fallback）影响，已事后修复并写入局限）。据此定位为“真实闭环执行证明 + 诚实零结果”，明确不写“收敛”“发现”。</w:t>
       </w:r>
     </w:p>
     <w:p>
@@ -1895,97 +2294,151 @@
           <w:i w:val="0"/>
           <w:sz w:val="21"/>
         </w:rPr>
-        <w:t>当前边界：主闭环为单目标 BO；R4 的 guardrail 为 agent/人类 review。据此措辞：MOBO 描述为“已实现、可用的 v2 能力”，不声称已驱动当前闭环。</w:t>
+        <w:t>演进：上述 6 轮回顾闭环为单目标 BO；2026-06 起 MOBO(ParEGO) + 真实 LLM 护栏已驱动 2 轮原生前瞻闭环（线 B，详见下框），构成“多轮原生前瞻执行链”。仍如实报告净改进为零、未超历史最优，不声称收敛或发现。</w:t>
       </w:r>
     </w:p>
     <w:p>
       <w:pPr>
         <w:spacing w:before="120" w:after="40"/>
-        <w:shd w:val="clear" w:color="auto" w:fill="FFF3CD"/>
+        <w:shd w:val="clear" w:color="auto" w:fill="D4EDDA"/>
       </w:pPr>
       <w:r>
         <w:rPr>
           <w:rFonts w:ascii="Times New Roman" w:hAnsi="Times New Roman" w:eastAsia="黑体"/>
           <w:b/>
-          <w:color w:val="8A6100"/>
+          <w:color w:val="145A32"/>
           <w:sz w:val="21"/>
         </w:rPr>
-        <w:t>【实验进行中 · 待插入：线 B 真实前瞻 MOBO 闭环（硬化 Pillar 3）】</w:t>
+        <w:t>【数据已回（2026-06）· 线 B 真实前瞻 MOBO 闭环：诚实执行、未超基准】</w:t>
       </w:r>
     </w:p>
     <w:p>
       <w:pPr>
         <w:spacing w:after="40"/>
         <w:ind w:left="283"/>
-        <w:shd w:val="clear" w:color="auto" w:fill="FFFBEA"/>
+        <w:shd w:val="clear" w:color="auto" w:fill="EAF7EE"/>
       </w:pPr>
       <w:r>
         <w:rPr>
           <w:rFonts w:ascii="Times New Roman" w:hAnsi="Times New Roman" w:eastAsia="宋体"/>
-          <w:color w:val="6B5510"/>
+          <w:color w:val="1B4D2E"/>
           <w:sz w:val="20"/>
         </w:rPr>
-        <w:t>已完成接线：run_optimization_loop.py 接入 MOBO(ParEGO)+真实 LLM guardrail（OpenRouter gpt-5.4，T=0）。</w:t>
+        <w:t>接线：优化闭环已接入 MOBO(ParEGO) + 真实 LLM 物理护栏（guardrail，OpenRouter gpt-5.4，temperature=0）。</w:t>
       </w:r>
     </w:p>
     <w:p>
       <w:pPr>
         <w:spacing w:after="40"/>
         <w:ind w:left="283"/>
-        <w:shd w:val="clear" w:color="auto" w:fill="FFFBEA"/>
+        <w:shd w:val="clear" w:color="auto" w:fill="EAF7EE"/>
       </w:pPr>
       <w:r>
         <w:rPr>
           <w:rFonts w:ascii="Times New Roman" w:hAnsi="Times New Roman" w:eastAsia="宋体"/>
-          <w:color w:val="6B5510"/>
+          <w:color w:val="1B4D2E"/>
           <w:sz w:val="20"/>
         </w:rPr>
-        <w:t>官方第一轮 recipe（已冻结、已 push 盖戳 2026-06-08）：raw MOBO R=0.0285/N=0.9841 → LLM 物理修正 R=0.28/N=0.96（safety passed）。</w:t>
+        <w:t>已执行 2 轮原生前瞻（均“冻结 + 推送盖戳 → 之后合成测量”，测量晚于冻结 1～2 天）：R1 原始 MOBO 解 R=0.0285/N=0.9841 → LLM 物理修正 R=0.28/N=0.96；R2 原始解 R=0.245/N=0.923 → LLM 修正 R=0.42/N=1.02。</w:t>
       </w:r>
     </w:p>
     <w:p>
       <w:pPr>
         <w:spacing w:after="40"/>
         <w:ind w:left="283"/>
-        <w:shd w:val="clear" w:color="auto" w:fill="FFFBEA"/>
+        <w:shd w:val="clear" w:color="auto" w:fill="EAF7EE"/>
       </w:pPr>
       <w:r>
         <w:rPr>
           <w:rFonts w:ascii="Times New Roman" w:hAnsi="Times New Roman" w:eastAsia="宋体"/>
-          <w:color w:val="6B5510"/>
+          <w:color w:val="1B4D2E"/>
           <w:sz w:val="20"/>
         </w:rPr>
-        <w:t>剧本：先冻结+push（已就绪的 execution-engine 硬门禁、hash 绑定人工批准）→ 合成该 (R,N) → 测 EIS → Stage0/manual Rb QC → score/Pareto gate → append-only 写回 → 再建议下一轮（反复）。</w:t>
+        <w:t>结果（已追加至历史数据库，trial 9/10）：两轮综合得分均未超过历史最优（trial 1，R=0.186/N=1.029，得分≈−1.94）；R=0.42/N=1.02 探到低 Eₐ_high 区但综合得分仍较低。</w:t>
       </w:r>
     </w:p>
     <w:p>
       <w:pPr>
         <w:spacing w:after="40"/>
         <w:ind w:left="283"/>
-        <w:shd w:val="clear" w:color="auto" w:fill="FFFBEA"/>
+        <w:shd w:val="clear" w:color="auto" w:fill="EAF7EE"/>
       </w:pPr>
       <w:r>
         <w:rPr>
           <w:rFonts w:ascii="Times New Roman" w:hAnsi="Times New Roman" w:eastAsia="宋体"/>
-          <w:color w:val="6B5510"/>
+          <w:color w:val="1B4D2E"/>
           <w:sz w:val="20"/>
         </w:rPr>
-        <w:t>预期：产出原生（非重建）多目标 Pareto 前沿与真实前瞻 registry；Pillar 3 强度 B+ → A。</w:t>
+        <w:t>定位：这是“真实闭环执行 + 诚实零净改进”的又一前瞻证据，明确不写“收敛/发现/普适最优”。创新点 3 由“单轮回顾闭环”升级为“多轮原生前瞻执行链”，证据强度 B+ → A−（净改进仍为零，如实报告）。</w:t>
       </w:r>
     </w:p>
     <w:p>
       <w:pPr>
         <w:spacing w:after="40"/>
         <w:ind w:left="283"/>
-        <w:shd w:val="clear" w:color="auto" w:fill="FFFBEA"/>
+        <w:shd w:val="clear" w:color="auto" w:fill="EAF7EE"/>
       </w:pPr>
       <w:r>
         <w:rPr>
           <w:rFonts w:ascii="Times New Roman" w:hAnsi="Times New Roman" w:eastAsia="宋体"/>
-          <w:color w:val="6B5510"/>
+          <w:color w:val="1B4D2E"/>
           <w:sz w:val="20"/>
         </w:rPr>
-        <w:t>已就绪：prospective_2026H2/line_B_mobo_closed_loop/（PREREGISTRATION.md + official_recipe.json）。</w:t>
+        <w:t>余项：线 B 第 3 轮 R=0.36/N=0.84 待测；数据齐后一次性重跑 S13/S14。</w:t>
+      </w:r>
+    </w:p>
+    <w:p>
+      <w:pPr>
+        <w:spacing w:before="80"/>
+        <w:jc w:val="center"/>
+      </w:pPr>
+      <w:r>
+        <w:drawing>
+          <wp:inline xmlns:a="http://schemas.openxmlformats.org/drawingml/2006/main" xmlns:pic="http://schemas.openxmlformats.org/drawingml/2006/picture">
+            <wp:extent cx="5760000" cy="2578116"/>
+            <wp:docPr id="3" name="Picture 3"/>
+            <wp:cNvGraphicFramePr>
+              <a:graphicFrameLocks noChangeAspect="1"/>
+            </wp:cNvGraphicFramePr>
+            <a:graphic>
+              <a:graphicData uri="http://schemas.openxmlformats.org/drawingml/2006/picture">
+                <pic:pic>
+                  <pic:nvPicPr>
+                    <pic:cNvPr id="0" name="Fig_lineB_arrhenius.png"/>
+                    <pic:cNvPicPr/>
+                  </pic:nvPicPr>
+                  <pic:blipFill>
+                    <a:blip r:embed="rId11"/>
+                    <a:stretch>
+                      <a:fillRect/>
+                    </a:stretch>
+                  </pic:blipFill>
+                  <pic:spPr>
+                    <a:xfrm>
+                      <a:off x="0" y="0"/>
+                      <a:ext cx="5760000" cy="2578116"/>
+                    </a:xfrm>
+                    <a:prstGeom prst="rect"/>
+                  </pic:spPr>
+                </pic:pic>
+              </a:graphicData>
+            </a:graphic>
+          </wp:inline>
+        </w:drawing>
+      </w:r>
+    </w:p>
+    <w:p>
+      <w:pPr>
+        <w:spacing w:after="160"/>
+      </w:pPr>
+      <w:r>
+        <w:rPr>
+          <w:rFonts w:ascii="Times New Roman" w:hAnsi="Times New Roman" w:eastAsia="宋体"/>
+          <w:i/>
+          <w:color w:val="555555"/>
+          <w:sz w:val="18"/>
+        </w:rPr>
+        <w:t>图 2　线 B 物理/QC 门控的 MOBO+LLM 前瞻闭环执行（2026-06）。面板 a：两轮原生前瞻配方的 ln σ 对 1000/T 曲线（R=0.28/N=0.96 为第 1 轮、R=0.42/N=1.02 为第 2 轮，均“冻结 + 推送盖戳 → 之后合成测量”）。面板 b：优化活动各轮的综合得分（越高越好）。新前瞻轮 T9/T10（橙）均低于历史最优 T1（绿色虚线，R=0.186/N=1.029）。这是“真实闭环执行 + 诚实零净改进”的前瞻证据，据此不声称收敛/发现/普适最优。</w:t>
       </w:r>
     </w:p>
     <w:p>
@@ -2028,7 +2481,7 @@
           <w:i w:val="0"/>
           <w:sz w:val="21"/>
         </w:rPr>
-        <w:t>宽温 EIS → QA → KK → Rb → σ → 分段 Arrhenius → bundle。KK 为 warning 级（非硬门禁）；几何采用实测厚度/面积；温序与 manual-Rb QC 按 descriptor_definition.md。DRT 以 max(G,0) 近似，仅 exploratory。</w:t>
+        <w:t>处理流程：宽温 EIS → 质量审查 → KK → 体相电阻 Rb → 电导 σ → 分段 Arrhenius → 结果打包。KK 为警告级（非硬门禁）；几何采用实测厚度/面积；温序与手动 Rb 的 QC 按预注册的描述符定义执行。弛豫时间分布（DRT）以 max(G,0) 近似，仅作探索级。</w:t>
       </w:r>
     </w:p>
     <w:p>
@@ -2057,7 +2510,7 @@
           <w:i w:val="0"/>
           <w:sz w:val="21"/>
         </w:rPr>
-        <w:t>单目标 BO（高斯过程 + Expected Improvement）为当前主闭环；多目标 MOBO(ParEGO) 已实现并可经 --optimizer mobo 启用。LLM guardrail 经 OpenRouter（gpt-5.4，temperature=0、8000 max tokens）调用，记录 provider/model/prompt SHA256/tokens 作为 provenance。设计变量 R（酸/水摩尔比）、N（液/黏土质量比）；多目标为 σ_RT↑、Ea_high↓、ea_low_excess↓。</w:t>
+        <w:t>单目标 BO（高斯过程 + 期望改进 EI）为当前主闭环；多目标 MOBO(ParEGO) 已实现并可选用。LLM 物理护栏经 OpenRouter（gpt-5.4，temperature=0、最大 8000 tokens）调用，记录提供方/模型/提示词 SHA256/token 数作为溯源（provenance）。设计变量为 R（酸/水摩尔比）、N（液/黏土质量比）；多目标为室温电导 σ_RT↑、高温段 Eₐ_high↓、冷尾超额活化能↓。</w:t>
       </w:r>
     </w:p>
     <w:p>
@@ -2086,7 +2539,7 @@
           <w:i w:val="0"/>
           <w:sz w:val="21"/>
         </w:rPr>
-        <w:t>Stage2 做证据清洗与 stage3_seed 导出；Stage3 经 S03–S14 全链路，真实 LLM + hybrid 文献（OpenAlex），末端确定性 claim 审计（S14）。权威投稿级输出为 20260607_openrouter_publication_v2。</w:t>
+        <w:t>Stage2 做证据清洗与机制种子导出；Stage3 经 S03–S14 全链路，真实 LLM + 混合（hybrid）文献检索（OpenAlex），末端为确定性主张审计（S14）。权威投稿级输出为 2026-06-07 的 OpenRouter 发布快照（详见“数据与代码可得性”）。</w:t>
       </w:r>
     </w:p>
     <w:p>
@@ -2115,7 +2568,7 @@
           <w:i w:val="0"/>
           <w:sz w:val="21"/>
         </w:rPr>
-        <w:t>前瞻主张遵循“测量前冻结 → git commit + push 盖服务器时间戳 → 再动手”的纪律（prospective_2026H2/）。代码与配置使用相对路径（PROJECT_ROOT），机器相关项经环境变量覆盖。</w:t>
+        <w:t>前瞻主张遵循“测量前冻结 → git 提交 + 推送以盖服务器时间戳 → 再动手”的纪律。代码与配置使用相对路径，机器相关项经环境变量覆盖。</w:t>
       </w:r>
     </w:p>
     <w:p>
@@ -2173,14 +2626,14 @@
           <w:b/>
           <w:sz w:val="21"/>
         </w:rPr>
-        <w:t>timing anchor 透明化：</w:t>
+        <w:t>时间锚点（timing anchor）透明化：</w:t>
       </w:r>
       <w:r>
         <w:rPr>
           <w:rFonts w:ascii="Times New Roman" w:hAnsi="Times New Roman" w:eastAsia="宋体"/>
           <w:sz w:val="21"/>
         </w:rPr>
-        <w:t>原 registry 在 cleanup commit 4b6ee61 中误删；preregistered_at=2026-05-08 由保留文件名时间戳 + provenance 重建，前瞻余量仅 1 天、5 选 2。主张降级为“LLM 排名候选在实验前被冻结并随后由宽温 EIS 验证（前瞻锚点为重建、已透明记录）”，并主打 04-17/04-19 早期查询包/paper card 作为“推理先于实验”的硬证据；线 A 完成后升级为原生 PASS。</w:t>
+        <w:t>原候选注册表在一次清理提交（commit 4b6ee61）中被误删；其预注册时间戳（2026-05-08）由保留的文件名时间戳与溯源记录重建，前瞻余量仅 1 天、5 选 2。据此主张降级为“LLM 排名候选在实验前被冻结并随后由宽温 EIS 验证（前瞻锚点为重建、已透明记录）”，并主打 04-17/04-19 的早期查询包与文献卡片作为“推理先于实验”的硬证据；线 A 完成后升级为原生通过。</w:t>
       </w:r>
     </w:p>
     <w:p>
@@ -2202,7 +2655,7 @@
           <w:rFonts w:ascii="Times New Roman" w:hAnsi="Times New Roman" w:eastAsia="宋体"/>
           <w:sz w:val="21"/>
         </w:rPr>
-        <w:t>用户已弃用 4.25CS，但 wide_temperature_performance_summary.csv 仍含其行；须从图件/正文剔除或明确标注弃用理由，避免与已剔除的 benchmark 表不一致。</w:t>
+        <w:t>已弃用 4.25CS，但宽温性能汇总表仍含其行；须从图件/正文剔除或明确标注弃用理由，避免与已剔除的对标表不一致。</w:t>
       </w:r>
     </w:p>
     <w:p>
@@ -2224,7 +2677,7 @@
           <w:rFonts w:ascii="Times New Roman" w:hAnsi="Times New Roman" w:eastAsia="宋体"/>
           <w:sz w:val="21"/>
         </w:rPr>
-        <w:t>明确 5.9CS 厚度 0.022 cm 为卡尺/SEM 实测，与 Stage1 的 0.022 fallback bug 无关；引用 geometry_audit_v2.csv 并解释 geometry_conflict 旗标处置。</w:t>
+        <w:t>明确 5.9CS 厚度 0.022 cm 为卡尺/SEM 实测，与 Stage1 的 0.022 几何回退（fallback）bug 无关；援引几何审计表（SI）并解释几何冲突旗标的处置。</w:t>
       </w:r>
     </w:p>
     <w:p>
@@ -2238,7 +2691,7 @@
           <w:color w:val="2B2B2B"/>
           <w:sz w:val="24"/>
         </w:rPr>
-        <w:t>7.2　P1：Pillar 2 科学加固（已用现有数据落实，见 4.2 节）</w:t>
+        <w:t>7.2　P1：创新点 2 科学加固（已用现有数据落实，见 4.2 节）</w:t>
       </w:r>
     </w:p>
     <w:p>
@@ -2282,7 +2735,7 @@
           <w:rFonts w:ascii="Times New Roman" w:hAnsi="Times New Roman" w:eastAsia="宋体"/>
           <w:sz w:val="21"/>
         </w:rPr>
-        <w:t>逐温度谱 KK 复算查明并修正了一处复数阻抗符号约定 bug（解析器输出真实 Im(Z)，旧 KK 代码却按正幅值再取负，致谱被翻成反因果共轭）。修正 Z=Zr+jZi + 高频感性尾裁剪后，全样 220 条谱 KK 警告由 133 降为 0、μ_median≈0.007。→ headline LRS 主窗口实为 KK 干净，强主张由“KK 一致 + 主窗口 Rb 一致 + 有界高温段 Eₐ”支撑。（这是相对原计划的诚实更正：原以为高温窗口 KK 脏，实为方法学伪影。Eₐ/σ 与 KK 无关、数值不变。脚本 kk_diagnostic.py / kk_verify_all.py 可复现。）</w:t>
+        <w:t>逐温度谱 KK 复算查明并修正了一处复数阻抗符号约定 bug（解析器输出真实 Im(Z)，旧 KK 代码却按正幅值再取负，致谱被翻成反因果共轭）。修正 Z=Zr+jZi + 高频感性尾裁剪后，全样 220 条谱 KK 警告由 133 降为 0、μ_median≈0.007。→ LRS 标志样品主窗口实为 KK 干净，强主张由“KK 一致 + 主窗口 Rb 一致 + 有界高温段 Eₐ”支撑。（这是相对原计划的诚实更正：原以为高温窗口 KK 脏，实为方法学伪影。Eₐ/σ 与 KK 无关、数值不变；相关诊断脚本见“数据与代码可得性”，可复现。）</w:t>
       </w:r>
     </w:p>
     <w:p>
@@ -2304,7 +2757,7 @@
           <w:rFonts w:ascii="Times New Roman" w:hAnsi="Times New Roman" w:eastAsia="宋体"/>
           <w:sz w:val="21"/>
         </w:rPr>
-        <w:t>改 NNLS，或明确“DRT 仅 exploratory，不作机制证据”。</w:t>
+        <w:t>改用非负最小二乘（NNLS），或明确“DRT 仅作探索级、不作机制证据”。</w:t>
       </w:r>
     </w:p>
     <w:p>
@@ -2318,7 +2771,7 @@
           <w:color w:val="2B2B2B"/>
           <w:sz w:val="24"/>
         </w:rPr>
-        <w:t>7.3　P2：Pillar 3 措辞对齐代码</w:t>
+        <w:t>7.3　P2：创新点 3 措辞与代码对齐</w:t>
       </w:r>
     </w:p>
     <w:p>
@@ -2340,7 +2793,7 @@
           <w:rFonts w:ascii="Times New Roman" w:hAnsi="Times New Roman" w:eastAsia="宋体"/>
           <w:sz w:val="21"/>
         </w:rPr>
-        <w:t>不写收敛/发现；BO improvement=0、best=Trial1 定位为执行证明 + 诚实零结果；7 次几何修复写入 SI。</w:t>
+        <w:t>不写“收敛/发现”；BO 绝对改进为 0、最优仍为 Trial 1，据此定位为“执行证明 + 诚实零结果”；7 次几何修复写入 SI。</w:t>
       </w:r>
     </w:p>
     <w:p>
@@ -2362,7 +2815,7 @@
           <w:rFonts w:ascii="Times New Roman" w:hAnsi="Times New Roman" w:eastAsia="宋体"/>
           <w:sz w:val="21"/>
         </w:rPr>
-        <w:t>R4 改名为 agent/human guardrail review，除非补真实 LLM API 调用记录（线 B 已具备 model+prompt hash+temperature=0）。</w:t>
+        <w:t>第 4 轮（R4）改称“智能体/人工护栏复核”，除非补充真实 LLM API 调用记录（线 B 已具备模型 + 提示词哈希 + temperature=0）。</w:t>
       </w:r>
     </w:p>
     <w:p>
@@ -2391,7 +2844,7 @@
           <w:i w:val="0"/>
           <w:sz w:val="21"/>
         </w:rPr>
-        <w:t>本工作以酸-黏土质子导体为母体系，给出一个受物理/QC/claim 治理的智能体材料发现框架：证据约束迁移智能体选/重组生物聚合物–黏土膜基元，冷却韧性描述符对韧性/非韧性体系具备区分力，物理/QC 门控的 BO+LLM 闭环如实报告诚实零结果，全程由确定性 claim 审计守门。其方法学贡献（claim 阶梯 + 确定性审计 + 执行引擎门禁）为可信智能体材料发现提供了可复现范式。</w:t>
+        <w:t>本工作以酸-黏土质子导体为母体系，给出一个受物理/QC/主张治理的智能体材料发现框架：证据约束迁移智能体选择/重组生物聚合物–黏土膜基元，冷却韧性描述符对韧性/非韧性体系具备区分力，物理/QC 门控的 BO+LLM 闭环如实报告诚实零结果，全程由确定性主张审计守门。其方法学贡献（主张阶梯 + 确定性审计 + 执行引擎门禁）为可信智能体材料发现提供了可复现范式。</w:t>
       </w:r>
     </w:p>
     <w:p>
@@ -2406,7 +2859,7 @@
           <w:i w:val="0"/>
           <w:sz w:val="21"/>
         </w:rPr>
-        <w:t>升级路线（与本文并行推进的实验）：线 A（生物聚合物前瞻）将把 Pillar 1 提升至 A；线 B（真实前瞻 MOBO 闭环）将把 Pillar 3 提升至 A 并产出原生多目标 Pareto 前沿。两线均严格执行“测量前冻结 → push 盖戳 → 再动手”。若两线证据到位，本文可由子刊升级转投 Nature Communications。</w:t>
+        <w:t>升级路线（与本文并行推进的实验）：线 A（生物聚合物前瞻）将把创新点 1 提升至 A；线 B（真实前瞻 MOBO 闭环）将把创新点 3 提升至 A 并产出原生多目标 Pareto 前沿。两线均严格执行“测量前冻结 → 推送盖戳 → 再动手”。若两线证据到位，本文可由子刊升级转投 Nature Communications。</w:t>
       </w:r>
     </w:p>
     <w:p>
@@ -2420,7 +2873,22 @@
           <w:color w:val="1F3864"/>
           <w:sz w:val="28"/>
         </w:rPr>
-        <w:t>图件清单（复用现有 Fig1–Fig7）</w:t>
+        <w:t>图件清单</w:t>
+      </w:r>
+    </w:p>
+    <w:p>
+      <w:pPr>
+        <w:spacing w:after="40" w:before="0" w:line="300" w:lineRule="auto"/>
+        <w:ind w:firstLine="420"/>
+      </w:pPr>
+      <w:r>
+        <w:rPr>
+          <w:rFonts w:ascii="Times New Roman" w:hAnsi="Times New Roman" w:eastAsia="宋体"/>
+          <w:b w:val="0"/>
+          <w:i w:val="0"/>
+          <w:sz w:val="21"/>
+        </w:rPr>
+        <w:t>已就绪并嵌入正文的结果图：</w:t>
       </w:r>
     </w:p>
     <w:p>
@@ -2435,14 +2903,14 @@
           <w:b/>
           <w:sz w:val="21"/>
         </w:rPr>
-        <w:t>Fig 1：</w:t>
+        <w:t>图 1（§3，已嵌入）：</w:t>
       </w:r>
       <w:r>
         <w:rPr>
           <w:rFonts w:ascii="Times New Roman" w:hAnsi="Times New Roman" w:eastAsia="宋体"/>
           <w:sz w:val="21"/>
         </w:rPr>
-        <w:t>智能体工作流与 harness（memory/critic/heartbeat + LLM 网关）。</w:t>
+        <w:t>线 A 原生前瞻：Arrhenius ln σ–1000/T（LRS×2 厚膜 vs 淀粉×2）+ 高温段活化能柱状对比（LRS≪淀粉，排名前瞻复现）。</w:t>
       </w:r>
     </w:p>
     <w:p>
@@ -2457,14 +2925,14 @@
           <w:b/>
           <w:sz w:val="21"/>
         </w:rPr>
-        <w:t>Fig 2：</w:t>
+        <w:t>图 2（§5，已嵌入）：</w:t>
       </w:r>
       <w:r>
         <w:rPr>
           <w:rFonts w:ascii="Times New Roman" w:hAnsi="Times New Roman" w:eastAsia="宋体"/>
           <w:sz w:val="21"/>
         </w:rPr>
-        <w:t>BO/LLM trade-off（含 improvement=0 的诚实呈现）。</w:t>
+        <w:t>线 B 闭环：两轮前瞻配方 Arrhenius + campaign 各轮综合得分（新前瞻轮均低于历史最优，诚实零净改进）。</w:t>
       </w:r>
     </w:p>
     <w:p>
@@ -2479,14 +2947,29 @@
           <w:b/>
           <w:sz w:val="21"/>
         </w:rPr>
-        <w:t>Fig 3：</w:t>
+        <w:t>Fig_pillar2_qc（§4.2，已嵌入）：</w:t>
       </w:r>
       <w:r>
         <w:rPr>
           <w:rFonts w:ascii="Times New Roman" w:hAnsi="Times New Roman" w:eastAsia="宋体"/>
           <w:sz w:val="21"/>
         </w:rPr>
-        <w:t>Stage3 候选排名稳定性（top1=1.0、top3 Jaccard=1.0）。</w:t>
+        <w:t>面板 A 高温段活化能–厚度散点（厚度×家族混淆）；面板 B 符号修正后逐温度 KK 残差（全部 « 0.2，数据 KK 一致）。</w:t>
+      </w:r>
+    </w:p>
+    <w:p>
+      <w:pPr>
+        <w:spacing w:after="40" w:before="80" w:line="300" w:lineRule="auto"/>
+        <w:ind w:firstLine="420"/>
+      </w:pPr>
+      <w:r>
+        <w:rPr>
+          <w:rFonts w:ascii="Times New Roman" w:hAnsi="Times New Roman" w:eastAsia="宋体"/>
+          <w:b w:val="0"/>
+          <w:i w:val="0"/>
+          <w:sz w:val="21"/>
+        </w:rPr>
+        <w:t>计划补充的示意/汇总图（schematic，待 AI 生成 + 矢量精修）：</w:t>
       </w:r>
     </w:p>
     <w:p>
@@ -2501,14 +2984,14 @@
           <w:b/>
           <w:sz w:val="21"/>
         </w:rPr>
-        <w:t>Fig 4：</w:t>
+        <w:t>Fig 架构：</w:t>
       </w:r>
       <w:r>
         <w:rPr>
           <w:rFonts w:ascii="Times New Roman" w:hAnsi="Times New Roman" w:eastAsia="宋体"/>
           <w:sz w:val="21"/>
         </w:rPr>
-        <w:t>宽温 σ(T)：LRS（韧性）vs CHITO（边界坍塌）。</w:t>
+        <w:t>智能体工作流与支撑架构（记忆/自省/心跳 + LLM 网关 + 主张审计门控）。</w:t>
       </w:r>
     </w:p>
     <w:p>
@@ -2523,14 +3006,14 @@
           <w:b/>
           <w:sz w:val="21"/>
         </w:rPr>
-        <w:t>Fig 5：</w:t>
+        <w:t>Fig 治理：</w:t>
       </w:r>
       <w:r>
         <w:rPr>
           <w:rFonts w:ascii="Times New Roman" w:hAnsi="Times New Roman" w:eastAsia="宋体"/>
           <w:sz w:val="21"/>
         </w:rPr>
-        <w:t>Eₐ benchmark（含厚度标注，对标 POP-2020/MFM-300(Cr)/母体系）。</w:t>
+        <w:t>主张治理示意：证据带划分与允许/禁止措辞裁决。</w:t>
       </w:r>
     </w:p>
     <w:p>
@@ -2545,14 +3028,14 @@
           <w:b/>
           <w:sz w:val="21"/>
         </w:rPr>
-        <w:t>Fig 5b：</w:t>
+        <w:t>Fig 排名稳定性：</w:t>
       </w:r>
       <w:r>
         <w:rPr>
           <w:rFonts w:ascii="Times New Roman" w:hAnsi="Times New Roman" w:eastAsia="宋体"/>
           <w:sz w:val="21"/>
         </w:rPr>
-        <w:t>已生成 Fig_pillar2_qc：面板 A Eₐ_high–厚度（厚度×家族混淆）；面板 B 符号修正后逐温度 KK 残差（全部 « 0.2，数据 KK 一致）。</w:t>
+        <w:t>迁移候选排名稳定性（top1=1.0、top3 Jaccard=1.0）。</w:t>
       </w:r>
     </w:p>
     <w:p>
@@ -2567,36 +3050,14 @@
           <w:b/>
           <w:sz w:val="21"/>
         </w:rPr>
-        <w:t>Fig 6：</w:t>
+        <w:t>Fig 活化能对标：</w:t>
       </w:r>
       <w:r>
         <w:rPr>
           <w:rFonts w:ascii="Times New Roman" w:hAnsi="Times New Roman" w:eastAsia="宋体"/>
           <w:sz w:val="21"/>
         </w:rPr>
-        <w:t>EIS QC 边界（KK/Rb，三 claim band）。</w:t>
-      </w:r>
-    </w:p>
-    <w:p>
-      <w:pPr>
-        <w:pStyle w:val="ListBullet"/>
-        <w:spacing w:after="60" w:line="288" w:lineRule="auto"/>
-        <w:ind w:left="425"/>
-      </w:pPr>
-      <w:r>
-        <w:rPr>
-          <w:rFonts w:ascii="Times New Roman" w:hAnsi="Times New Roman" w:eastAsia="宋体"/>
-          <w:b/>
-          <w:sz w:val="21"/>
-        </w:rPr>
-        <w:t>Fig 7：</w:t>
-      </w:r>
-      <w:r>
-        <w:rPr>
-          <w:rFonts w:ascii="Times New Roman" w:hAnsi="Times New Roman" w:eastAsia="宋体"/>
-          <w:sz w:val="21"/>
-        </w:rPr>
-        <w:t>BO 目标 / claim 审计裁决可视化。</w:t>
+        <w:t>高温段活化能基准对标（含厚度标注，对标 POP-2020/MFM-300(Cr)/母体系）。</w:t>
       </w:r>
     </w:p>
     <w:p>
@@ -2615,6 +3076,22 @@
     </w:p>
     <w:p>
       <w:pPr>
+        <w:spacing w:after="40" w:before="0" w:line="300" w:lineRule="auto"/>
+        <w:ind w:firstLine="420"/>
+      </w:pPr>
+      <w:r>
+        <w:rPr>
+          <w:rFonts w:ascii="Times New Roman" w:hAnsi="Times New Roman" w:eastAsia="宋体"/>
+          <w:b w:val="0"/>
+          <w:i w:val="0"/>
+          <w:color w:val="888888"/>
+          <w:sz w:val="18"/>
+        </w:rPr>
+        <w:t>（以下括注为对应的数据/脚本文件名，便于复现；正文已不再内联文件名。）</w:t>
+      </w:r>
+    </w:p>
+    <w:p>
+      <w:pPr>
         <w:pStyle w:val="ListBullet"/>
         <w:spacing w:after="60" w:line="288" w:lineRule="auto"/>
         <w:ind w:left="425"/>
@@ -2624,7 +3101,7 @@
           <w:rFonts w:ascii="Times New Roman" w:hAnsi="Times New Roman" w:eastAsia="宋体"/>
           <w:sz w:val="21"/>
         </w:rPr>
-        <w:t>timing anchor 重建说明与 git 取证（commit 4b6ee61、文件名时间戳、1 天余量、5 选 2）。</w:t>
+        <w:t>时间锚点重建说明与 git 取证（清理提交 commit 4b6ee61、文件名时间戳、1 天余量、5 选 2）。</w:t>
       </w:r>
     </w:p>
     <w:p>
@@ -2638,7 +3115,7 @@
           <w:rFonts w:ascii="Times New Roman" w:hAnsi="Times New Roman" w:eastAsia="宋体"/>
           <w:sz w:val="21"/>
         </w:rPr>
-        <w:t>完整 closed_loop_metrics（improvement=0、7 次几何修复、limitations）。</w:t>
+        <w:t>完整闭环指标（绝对改进为 0、7 次几何修复、局限清单）。</w:t>
       </w:r>
     </w:p>
     <w:p>
@@ -2652,7 +3129,7 @@
           <w:rFonts w:ascii="Times New Roman" w:hAnsi="Times New Roman" w:eastAsia="宋体"/>
           <w:sz w:val="21"/>
         </w:rPr>
-        <w:t>逐温度 KK residual 表（kk_residual_per_temperature.csv，独立 lin-KK 复算）+ 按 band 的 KK 警告比例（kk_warning_fraction_by_band_LRS.csv）+ Rb 一致性门控表（kk_rb_band_gating_table.csv，含 manual vs auto Rb）。</w:t>
+        <w:t>逐温度 KK 残差表（kk_residual_per_temperature.csv，独立 lin-KK 复算）+ 按证据带的 KK 警告比例（kk_warning_fraction_by_band_LRS.csv）+ Rb 一致性门控表（kk_rb_band_gating_table.csv，含手动与自动 Rb 对比）。</w:t>
       </w:r>
     </w:p>
     <w:p>
@@ -2666,7 +3143,7 @@
           <w:rFonts w:ascii="Times New Roman" w:hAnsi="Times New Roman" w:eastAsia="宋体"/>
           <w:sz w:val="21"/>
         </w:rPr>
-        <w:t>Eₐ_high vs 厚度散点（ea_vs_thickness.csv / Fig_pillar2_qc 面板 A）与几何审计（geometry_audit_v2.csv，geometry_conflict 处置）；4.25CS 弃用说明见 DEPRECATED_SAMPLES.md。</w:t>
+        <w:t>高温段活化能 vs 厚度散点（ea_vs_thickness.csv / Fig_pillar2_qc 面板 A）与几何审计（geometry_audit_v2.csv，几何冲突处置）；4.25CS 弃用说明见 DEPRECATED_SAMPLES.md。</w:t>
       </w:r>
     </w:p>
     <w:p>
@@ -2680,7 +3157,7 @@
           <w:rFonts w:ascii="Times New Roman" w:hAnsi="Times New Roman" w:eastAsia="宋体"/>
           <w:sz w:val="21"/>
         </w:rPr>
-        <w:t>claim 审计完整裁决（允许/禁止措辞、各 band）。</w:t>
+        <w:t>主张审计完整裁决（允许/禁止措辞、各证据带）。</w:t>
       </w:r>
     </w:p>
     <w:p>
@@ -2694,7 +3171,220 @@
           <w:rFonts w:ascii="Times New Roman" w:hAnsi="Times New Roman" w:eastAsia="宋体"/>
           <w:sz w:val="21"/>
         </w:rPr>
-        <w:t>线 A / 线 B 预注册包与 push 时间戳（原生前瞻证据）。</w:t>
+        <w:t>线 A / 线 B 预注册包与推送时间戳（原生前瞻证据）。</w:t>
+      </w:r>
+    </w:p>
+    <w:p>
+      <w:pPr>
+        <w:spacing w:before="240" w:after="120"/>
+      </w:pPr>
+      <w:r>
+        <w:rPr>
+          <w:rFonts w:ascii="Times New Roman" w:hAnsi="Times New Roman" w:eastAsia="黑体"/>
+          <w:b/>
+          <w:color w:val="1F3864"/>
+          <w:sz w:val="28"/>
+        </w:rPr>
+        <w:t>参考文献</w:t>
+      </w:r>
+    </w:p>
+    <w:p>
+      <w:pPr>
+        <w:spacing w:after="80" w:before="0" w:line="300" w:lineRule="auto"/>
+        <w:ind w:firstLine="0"/>
+      </w:pPr>
+      <w:r>
+        <w:rPr>
+          <w:rFonts w:ascii="Times New Roman" w:hAnsi="Times New Roman" w:eastAsia="宋体"/>
+          <w:b w:val="0"/>
+          <w:i w:val="0"/>
+          <w:color w:val="888888"/>
+          <w:sz w:val="18"/>
+        </w:rPr>
+        <w:t>（占位：以下为正文引用文献的占位条目，待按目标期刊格式补全卷期页与 DOI。）</w:t>
+      </w:r>
+    </w:p>
+    <w:p>
+      <w:pPr>
+        <w:pStyle w:val="ListBullet"/>
+        <w:spacing w:after="60" w:line="288" w:lineRule="auto"/>
+        <w:ind w:left="425"/>
+      </w:pPr>
+      <w:r>
+        <w:rPr>
+          <w:rFonts w:ascii="Times New Roman" w:hAnsi="Times New Roman" w:eastAsia="宋体"/>
+          <w:b/>
+          <w:sz w:val="21"/>
+        </w:rPr>
+        <w:t xml:space="preserve">[1]  </w:t>
+      </w:r>
+      <w:r>
+        <w:rPr>
+          <w:rFonts w:ascii="Times New Roman" w:hAnsi="Times New Roman" w:eastAsia="宋体"/>
+          <w:sz w:val="21"/>
+        </w:rPr>
+        <w:t>Schönleber, M.; Klotz, D.; Ivers-Tiffée, E. A method for improving the robustness of linear Kramers–Kronig validity tests. Electrochimica Acta 131, 20–27 (2014). [lin-KK 方法]</w:t>
+      </w:r>
+    </w:p>
+    <w:p>
+      <w:pPr>
+        <w:pStyle w:val="ListBullet"/>
+        <w:spacing w:after="60" w:line="288" w:lineRule="auto"/>
+        <w:ind w:left="425"/>
+      </w:pPr>
+      <w:r>
+        <w:rPr>
+          <w:rFonts w:ascii="Times New Roman" w:hAnsi="Times New Roman" w:eastAsia="宋体"/>
+          <w:b/>
+          <w:sz w:val="21"/>
+        </w:rPr>
+        <w:t xml:space="preserve">[2]  </w:t>
+      </w:r>
+      <w:r>
+        <w:rPr>
+          <w:rFonts w:ascii="Times New Roman" w:hAnsi="Times New Roman" w:eastAsia="宋体"/>
+          <w:sz w:val="21"/>
+        </w:rPr>
+        <w:t>[POP-2020] 待补：多孔有机聚合物质子导体，报道 Eₐ≈0.039 eV（作者/期刊/年/卷期页/DOI 待补）。</w:t>
+      </w:r>
+    </w:p>
+    <w:p>
+      <w:pPr>
+        <w:pStyle w:val="ListBullet"/>
+        <w:spacing w:after="60" w:line="288" w:lineRule="auto"/>
+        <w:ind w:left="425"/>
+      </w:pPr>
+      <w:r>
+        <w:rPr>
+          <w:rFonts w:ascii="Times New Roman" w:hAnsi="Times New Roman" w:eastAsia="宋体"/>
+          <w:b/>
+          <w:sz w:val="21"/>
+        </w:rPr>
+        <w:t xml:space="preserve">[3]  </w:t>
+      </w:r>
+      <w:r>
+        <w:rPr>
+          <w:rFonts w:ascii="Times New Roman" w:hAnsi="Times New Roman" w:eastAsia="宋体"/>
+          <w:sz w:val="21"/>
+        </w:rPr>
+        <w:t>[MFM-300(Cr)] 待补：金属–有机框架质子导体，报道 Eₐ≈0.040 eV（出处待补）。</w:t>
+      </w:r>
+    </w:p>
+    <w:p>
+      <w:pPr>
+        <w:pStyle w:val="ListBullet"/>
+        <w:spacing w:after="60" w:line="288" w:lineRule="auto"/>
+        <w:ind w:left="425"/>
+      </w:pPr>
+      <w:r>
+        <w:rPr>
+          <w:rFonts w:ascii="Times New Roman" w:hAnsi="Times New Roman" w:eastAsia="宋体"/>
+          <w:b/>
+          <w:sz w:val="21"/>
+        </w:rPr>
+        <w:t xml:space="preserve">[4]  </w:t>
+      </w:r>
+      <w:r>
+        <w:rPr>
+          <w:rFonts w:ascii="Times New Roman" w:hAnsi="Times New Roman" w:eastAsia="宋体"/>
+          <w:sz w:val="21"/>
+        </w:rPr>
+        <w:t>[酸-黏土母体系 AiCE] 待补：本课题组/文献的凹凸棒土–海泡石酸-黏土质子导体（出处待补）。</w:t>
+      </w:r>
+    </w:p>
+    <w:p>
+      <w:pPr>
+        <w:pStyle w:val="ListBullet"/>
+        <w:spacing w:after="60" w:line="288" w:lineRule="auto"/>
+        <w:ind w:left="425"/>
+      </w:pPr>
+      <w:r>
+        <w:rPr>
+          <w:rFonts w:ascii="Times New Roman" w:hAnsi="Times New Roman" w:eastAsia="宋体"/>
+          <w:b/>
+          <w:sz w:val="21"/>
+        </w:rPr>
+        <w:t xml:space="preserve">[5]  </w:t>
+      </w:r>
+      <w:r>
+        <w:rPr>
+          <w:rFonts w:ascii="Times New Roman" w:hAnsi="Times New Roman" w:eastAsia="宋体"/>
+          <w:sz w:val="21"/>
+        </w:rPr>
+        <w:t>[综述-低温质子传导] 待补：固态质子导体低温性能退化机理综述（出处待补）。</w:t>
+      </w:r>
+    </w:p>
+    <w:p>
+      <w:pPr>
+        <w:pStyle w:val="ListBullet"/>
+        <w:spacing w:after="60" w:line="288" w:lineRule="auto"/>
+        <w:ind w:left="425"/>
+      </w:pPr>
+      <w:r>
+        <w:rPr>
+          <w:rFonts w:ascii="Times New Roman" w:hAnsi="Times New Roman" w:eastAsia="宋体"/>
+          <w:b/>
+          <w:sz w:val="21"/>
+        </w:rPr>
+        <w:t xml:space="preserve">[6]  </w:t>
+      </w:r>
+      <w:r>
+        <w:rPr>
+          <w:rFonts w:ascii="Times New Roman" w:hAnsi="Times New Roman" w:eastAsia="宋体"/>
+          <w:sz w:val="21"/>
+        </w:rPr>
+        <w:t>[BO 材料优化] 待补：贝叶斯优化用于材料配方/工艺优化的代表工作（出处待补）。</w:t>
+      </w:r>
+    </w:p>
+    <w:p>
+      <w:pPr>
+        <w:pStyle w:val="ListBullet"/>
+        <w:spacing w:after="60" w:line="288" w:lineRule="auto"/>
+        <w:ind w:left="425"/>
+      </w:pPr>
+      <w:r>
+        <w:rPr>
+          <w:rFonts w:ascii="Times New Roman" w:hAnsi="Times New Roman" w:eastAsia="宋体"/>
+          <w:b/>
+          <w:sz w:val="21"/>
+        </w:rPr>
+        <w:t xml:space="preserve">[7]  </w:t>
+      </w:r>
+      <w:r>
+        <w:rPr>
+          <w:rFonts w:ascii="Times New Roman" w:hAnsi="Times New Roman" w:eastAsia="宋体"/>
+          <w:sz w:val="21"/>
+        </w:rPr>
+        <w:t>[LLM 智能体材料发现] 待补：大语言模型/智能体驱动材料发现的代表工作（出处待补）。</w:t>
+      </w:r>
+    </w:p>
+    <w:p>
+      <w:pPr>
+        <w:spacing w:before="240" w:after="120"/>
+      </w:pPr>
+      <w:r>
+        <w:rPr>
+          <w:rFonts w:ascii="Times New Roman" w:hAnsi="Times New Roman" w:eastAsia="黑体"/>
+          <w:b/>
+          <w:color w:val="1F3864"/>
+          <w:sz w:val="28"/>
+        </w:rPr>
+        <w:t>数据与代码可得性</w:t>
+      </w:r>
+    </w:p>
+    <w:p>
+      <w:pPr>
+        <w:spacing w:after="120" w:before="0" w:line="300" w:lineRule="auto"/>
+        <w:ind w:firstLine="420"/>
+      </w:pPr>
+      <w:r>
+        <w:rPr>
+          <w:rFonts w:ascii="Times New Roman" w:hAnsi="Times New Roman" w:eastAsia="宋体"/>
+          <w:b w:val="0"/>
+          <w:i w:val="0"/>
+          <w:sz w:val="21"/>
+        </w:rPr>
+        <w:t>支撑本研究结论的原始 EIS 谱、处理产物（σ(T)/分段 Arrhenius）、闭环历史数据库、前瞻注册表与预注册包、以及全部分析/绘图脚本，均在项目仓库内按相对路径组织、可复现获取；关键脚本包括 KK 诊断/复算（kk_diagnostic.py、kk_verify_all.py）、Pillar 2 QC 工件（build_pillar2_qc_artifacts.py）与结果作图（plot_results.py）。前瞻主张的服务器时间戳由 git 提交/推送记录佐证。具体路径与版本将于投稿时整理为数据可得性声明。</w:t>
       </w:r>
     </w:p>
     <w:p>
@@ -2710,7 +3400,7 @@
           <w:color w:val="999999"/>
           <w:sz w:val="18"/>
         </w:rPr>
-        <w:t>——初稿 v1 结束（黄色框为实验升级插槽）——</w:t>
+        <w:t>——初稿 v1 结束（绿色框为已完成的原生前瞻批次；黄色框（若有）为待回插槽）——</w:t>
       </w:r>
     </w:p>
     <w:sectPr>

</xml_diff>